<commit_message>
Full rebuild of the project
</commit_message>
<xml_diff>
--- a/Uzdevums.docx
+++ b/Uzdevums.docx
@@ -543,77 +543,7 @@
           <w:rFonts w:cs="Calibri" w:cstheme="minorHAnsi"/>
           <w:color w:val="FF0000"/>
         </w:rPr>
-        <w:t xml:space="preserve">ATBILDE: </w:t>
-      </w:r>
-      <w:r>
-        <w:rPr>
-          <w:rFonts w:cs="Calibri" w:cstheme="minorHAnsi"/>
-          <w:color w:val="FF0000"/>
-        </w:rPr>
-        <w:t xml:space="preserve">Ideālā gadījumā </w:t>
-      </w:r>
-      <w:r>
-        <w:rPr>
-          <w:rFonts w:cs="Calibri" w:cstheme="minorHAnsi"/>
-          <w:color w:val="FF0000"/>
-        </w:rPr>
-        <w:t>dažāda tipa</w:t>
-      </w:r>
-      <w:r>
-        <w:rPr>
-          <w:rFonts w:cs="Calibri" w:cstheme="minorHAnsi"/>
-          <w:color w:val="FF0000"/>
-        </w:rPr>
-        <w:t xml:space="preserve"> biznesa objekti ti</w:t>
-      </w:r>
-      <w:r>
-        <w:rPr>
-          <w:rFonts w:cs="Calibri" w:cstheme="minorHAnsi"/>
-          <w:color w:val="FF0000"/>
-        </w:rPr>
-        <w:t xml:space="preserve">ek </w:t>
-      </w:r>
-      <w:r>
-        <w:rPr>
-          <w:rFonts w:cs="Calibri" w:cstheme="minorHAnsi"/>
-          <w:color w:val="FF0000"/>
-        </w:rPr>
-        <w:t xml:space="preserve">nodalīti tabulās, </w:t>
-      </w:r>
-      <w:r>
-        <w:rPr>
-          <w:rFonts w:cs="Calibri" w:cstheme="minorHAnsi"/>
-          <w:color w:val="FF0000"/>
-        </w:rPr>
-        <w:t>kas</w:t>
-      </w:r>
-      <w:r>
-        <w:rPr>
-          <w:rFonts w:cs="Calibri" w:cstheme="minorHAnsi"/>
-          <w:color w:val="FF0000"/>
-        </w:rPr>
-        <w:t xml:space="preserve"> nesaturētu dublikātus, pielīdzinot to skaitu rindu skaitam tabulās. Situācijās kur saskaitīšanas loģika var atšķirties pa produktiem ieteicams loģikas rezultātu saglabāt klasifikatoru vērtībās, kuras </w:t>
-      </w:r>
-      <w:r>
-        <w:rPr>
-          <w:rFonts w:cs="Calibri" w:cstheme="minorHAnsi"/>
-          <w:color w:val="FF0000"/>
-        </w:rPr>
-        <w:t>skaitīt būs daudz ātrāk un kuru unikālais skaits būs fiksēts to klasifikatoru vērtību tabulā.</w:t>
-      </w:r>
-      <w:r>
-        <w:rPr>
-          <w:rFonts w:cs="Calibri" w:cstheme="minorHAnsi"/>
-          <w:color w:val="FF0000"/>
-        </w:rPr>
-        <w:t xml:space="preserve">  Un protams kur tas nav iespējams vai nav praktiski, </w:t>
-      </w:r>
-      <w:r>
-        <w:rPr>
-          <w:rFonts w:cs="Calibri" w:cstheme="minorHAnsi"/>
-          <w:color w:val="FF0000"/>
-        </w:rPr>
-        <w:t xml:space="preserve">nāksies pielietot DISTINCT CASE IIF un COUNT skatos/materializētās tabulās atkarībā no datu pielietojuma. </w:t>
+        <w:t xml:space="preserve">ATBILDE: Ideālā gadījumā dažāda tipa biznesa objekti tiek nodalīti tabulās, kas nesaturētu dublikātus, pielīdzinot to skaitu rindu skaitam tabulās. Situācijās kur saskaitīšanas loģika var atšķirties pa produktiem ieteicams loģikas rezultātu saglabāt klasifikatoru vērtībās, kuras skaitīt būs daudz ātrāk un kuru unikālais skaits būs fiksēts to klasifikatoru vērtību tabulā.  Un protams kur tas nav iespējams vai nav praktiski, nāksies pielietot DISTINCT CASE IIF un COUNT skatos/materializētās tabulās atkarībā no datu pielietojuma. </w:t>
       </w:r>
     </w:p>
     <w:p>
@@ -722,6 +652,37 @@
           <w:rFonts w:cs="Calibri" w:cstheme="minorHAnsi"/>
         </w:rPr>
         <w:t>UniqueMonth- Pēdējais unikālais piedāvājums mēneša ietvaros(30dienas);</w:t>
+        <w:br/>
+        <w:br/>
+      </w:r>
+      <w:r>
+        <w:rPr>
+          <w:rFonts w:cs="Calibri" w:cstheme="minorHAnsi"/>
+          <w:color w:val="FF0000"/>
+        </w:rPr>
+        <w:t>Pieņēmums: Unikālu polises piedāvājumu identificē id_offers kolonas pirmie 14 simboli. Uzdevuma ietvaros jāizveido skript, kas spēs identificēt jaunākos ierakstus par polises piedāvājumiem un atgriezīs tos par norādīto intervālu pagātnē skaitot dienas no šodienas.</w:t>
+        <w:br/>
+      </w:r>
+      <w:r>
+        <w:rPr>
+          <w:rFonts w:cs="Calibri" w:cstheme="minorHAnsi"/>
+          <w:color w:val="FF0000"/>
+        </w:rPr>
+        <w:t>Risinājums:jupyter/latest_status_for_period.ipynb vai models/gold/business_analysis/offer/*.py</w:t>
+      </w:r>
+      <w:r>
+        <w:rPr>
+          <w:rFonts w:cs="Calibri" w:cstheme="minorHAnsi"/>
+          <w:color w:val="FF0000"/>
+        </w:rPr>
+        <w:br/>
+      </w:r>
+      <w:r>
+        <w:rPr>
+          <w:rFonts w:cs="Calibri" w:cstheme="minorHAnsi"/>
+          <w:color w:val="FF0000"/>
+        </w:rPr>
+        <w:t xml:space="preserve">Par efektivitāti: Risinājums pēc noklusējuma neizmantos pilnus servera resursus lai paralizētu apstrādes procesu, bet apply un loc funkcijām ir potenciāls strādāt uz dataframe datiem paralēli, attiecīgi risinājums ir efektīvs. </w:t>
       </w:r>
     </w:p>
     <w:p>
@@ -747,14 +708,21 @@
           <w:rFonts w:cs="Calibri" w:cstheme="minorHAnsi"/>
           <w:color w:val="FF0000"/>
         </w:rPr>
-        <w:t xml:space="preserve">ATBILDE: </w:t>
+        <w:t xml:space="preserve">ATBILDE: Atbilde ir atkarīga no datu apjoma un izmantotā datu apstrādes ietvara. </w:t>
       </w:r>
       <w:r>
         <w:rPr>
           <w:rFonts w:cs="Calibri" w:cstheme="minorHAnsi"/>
           <w:color w:val="FF0000"/>
         </w:rPr>
-        <w:t xml:space="preserve">Atbilde ir atkarīga no datu apjoma un izmantotā datu apstrādes ietvara. Lielākajā daļā gadījumu šāda parametra veidošana būtu ātrāka datubāzes līmenī izmantojot row_number  un group by. Pie ļoti lieliem datu apjomiem,  datu apstrādes ietvari kā Spark var apsteigt datu apstrādi datubāzē, tikai tapēc ka Spark ietvaram var būt priekšrocība horizontālā mērogošanā un spējā kārtošanas operācijas izpildīt uz vairāk serveriem paralēli.   </w:t>
+        <w:t xml:space="preserve">Pieņemot ka visiem kandidāt datu apstrādes ietvariem tik piedāvāts vienāds resursu daudzums un dati ietilpst sistēmas atmiņā, </w:t>
+      </w:r>
+      <w:r>
+        <w:rPr>
+          <w:rFonts w:cs="Calibri" w:cstheme="minorHAnsi"/>
+          <w:color w:val="FF0000"/>
+        </w:rPr>
+        <w:t xml:space="preserve"> šāda parametra veidošana būtu ātrāka datubāzes līmenī izmantojot row_number  un group by. Pie ļoti lieliem datu apjomiem,  datu apstrādes ietvari kā Spark var apsteigt datu apstrādi datubāzē, tikai tapēc ka Spark ietvaram var būt priekšrocība horizontālā mērogošanā un spējā kārtošanas operācijas izpildīt uz vairāk serveriem paralēli.   </w:t>
       </w:r>
     </w:p>
     <w:p>
@@ -799,6 +767,45 @@
           <w:rFonts w:cs="Calibri" w:cstheme="minorHAnsi"/>
         </w:rPr>
         <w:t>tabulā;</w:t>
+        <w:br/>
+      </w:r>
+      <w:r>
+        <w:rPr>
+          <w:rFonts w:cs="Calibri" w:cstheme="minorHAnsi"/>
+          <w:color w:val="FF0000"/>
+        </w:rPr>
+        <w:t xml:space="preserve">ATBILDE:  </w:t>
+      </w:r>
+      <w:r>
+        <w:rPr>
+          <w:rFonts w:cs="Calibri" w:cstheme="minorHAnsi"/>
+          <w:color w:val="FF0000"/>
+        </w:rPr>
+        <w:t>C</w:t>
+      </w:r>
+      <w:r>
+        <w:rPr>
+          <w:rFonts w:cs="Calibri" w:cstheme="minorHAnsi"/>
+          <w:i/>
+          <w:color w:val="FF0000"/>
+        </w:rPr>
+        <w:t xml:space="preserve">ustomer </w:t>
+      </w:r>
+      <w:r>
+        <w:rPr>
+          <w:rFonts w:cs="Calibri" w:cstheme="minorHAnsi"/>
+          <w:i/>
+          <w:color w:val="FF0000"/>
+        </w:rPr>
+        <w:t xml:space="preserve">tabulā ir 15 ieraksti ar dublicētiem policy_id; 43 klientiem nav polises ierakstu. </w:t>
+      </w:r>
+      <w:r>
+        <w:rPr>
+          <w:rFonts w:cs="Calibri" w:cstheme="minorHAnsi"/>
+          <w:i/>
+          <w:color w:val="FF0000"/>
+        </w:rPr>
+        <w:t>466 klientu ieraksti izveidoti pēc polises uzsākšanas datuma (d_customer_created_at &gt; d_policy_start_date)  un starp tiem 170 pēc tam kad to polises bija noslēgušās (d_customer_created_at &gt; d_policy_end_date)</w:t>
       </w:r>
     </w:p>
     <w:p>
@@ -1108,21 +1115,22 @@
         <w:tblLook w:firstRow="1" w:noVBand="1" w:lastRow="0" w:firstColumn="1" w:lastColumn="0" w:noHBand="0" w:val="04a0"/>
       </w:tblPr>
       <w:tblGrid>
-        <w:gridCol w:w="1602"/>
+        <w:gridCol w:w="1601"/>
         <w:gridCol w:w="3608"/>
-        <w:gridCol w:w="3086"/>
+        <w:gridCol w:w="3087"/>
       </w:tblGrid>
       <w:tr>
         <w:trPr/>
         <w:tc>
           <w:tcPr>
-            <w:tcW w:w="1602" w:type="dxa"/>
-            <w:tcBorders/>
-          </w:tcPr>
-          <w:p>
-            <w:pPr>
-              <w:pStyle w:val="Normal"/>
-              <w:widowControl/>
+            <w:tcW w:w="1601" w:type="dxa"/>
+            <w:tcBorders/>
+          </w:tcPr>
+          <w:p>
+            <w:pPr>
+              <w:pStyle w:val="Normal"/>
+              <w:widowControl/>
+              <w:suppressAutoHyphens w:val="true"/>
               <w:spacing w:lineRule="auto" w:line="240" w:beforeAutospacing="1" w:after="0"/>
               <w:jc w:val="left"/>
               <w:rPr>
@@ -1140,17 +1148,7 @@
                 <w:szCs w:val="22"/>
                 <w:lang w:val="lv-LV" w:eastAsia="lv-LV" w:bidi="ar-SA"/>
               </w:rPr>
-              <w:t>Object </w:t>
-            </w:r>
-            <w:r>
-              <w:rPr>
-                <w:rFonts w:eastAsia="Times New Roman" w:cs="Calibri" w:cstheme="minorHAnsi"/>
-                <w:kern w:val="0"/>
-                <w:sz w:val="22"/>
-                <w:szCs w:val="22"/>
-                <w:lang w:val="lv-LV" w:eastAsia="lv-LV" w:bidi="ar-SA"/>
-              </w:rPr>
-              <w:t> </w:t>
+              <w:t>Object</w:t>
             </w:r>
           </w:p>
         </w:tc>
@@ -1163,6 +1161,7 @@
             <w:pPr>
               <w:pStyle w:val="Normal"/>
               <w:widowControl/>
+              <w:suppressAutoHyphens w:val="true"/>
               <w:spacing w:lineRule="auto" w:line="240" w:beforeAutospacing="1" w:after="0"/>
               <w:jc w:val="left"/>
               <w:rPr>
@@ -1180,29 +1179,20 @@
                 <w:szCs w:val="22"/>
                 <w:lang w:val="lv-LV" w:eastAsia="lv-LV" w:bidi="ar-SA"/>
               </w:rPr>
-              <w:t>Format </w:t>
-            </w:r>
-            <w:r>
-              <w:rPr>
-                <w:rFonts w:eastAsia="Times New Roman" w:cs="Calibri" w:cstheme="minorHAnsi"/>
-                <w:kern w:val="0"/>
-                <w:sz w:val="22"/>
-                <w:szCs w:val="22"/>
-                <w:lang w:val="lv-LV" w:eastAsia="lv-LV" w:bidi="ar-SA"/>
-              </w:rPr>
-              <w:t> </w:t>
-            </w:r>
-          </w:p>
-        </w:tc>
-        <w:tc>
-          <w:tcPr>
-            <w:tcW w:w="3086" w:type="dxa"/>
-            <w:tcBorders/>
-          </w:tcPr>
-          <w:p>
-            <w:pPr>
-              <w:pStyle w:val="Normal"/>
-              <w:widowControl/>
+              <w:t>Format</w:t>
+            </w:r>
+          </w:p>
+        </w:tc>
+        <w:tc>
+          <w:tcPr>
+            <w:tcW w:w="3087" w:type="dxa"/>
+            <w:tcBorders/>
+          </w:tcPr>
+          <w:p>
+            <w:pPr>
+              <w:pStyle w:val="Normal"/>
+              <w:widowControl/>
+              <w:suppressAutoHyphens w:val="true"/>
               <w:spacing w:lineRule="auto" w:line="240" w:beforeAutospacing="1" w:after="0"/>
               <w:jc w:val="left"/>
               <w:rPr>
@@ -1220,17 +1210,7 @@
                 <w:szCs w:val="22"/>
                 <w:lang w:val="lv-LV" w:eastAsia="lv-LV" w:bidi="ar-SA"/>
               </w:rPr>
-              <w:t>Example </w:t>
-            </w:r>
-            <w:r>
-              <w:rPr>
-                <w:rFonts w:eastAsia="Times New Roman" w:cs="Calibri" w:cstheme="minorHAnsi"/>
-                <w:kern w:val="0"/>
-                <w:sz w:val="22"/>
-                <w:szCs w:val="22"/>
-                <w:lang w:val="lv-LV" w:eastAsia="lv-LV" w:bidi="ar-SA"/>
-              </w:rPr>
-              <w:t> </w:t>
+              <w:t>Example</w:t>
             </w:r>
           </w:p>
         </w:tc>
@@ -1239,29 +1219,30 @@
         <w:trPr/>
         <w:tc>
           <w:tcPr>
-            <w:tcW w:w="1602" w:type="dxa"/>
-            <w:tcBorders/>
-          </w:tcPr>
-          <w:p>
-            <w:pPr>
-              <w:pStyle w:val="Normal"/>
-              <w:widowControl/>
-              <w:spacing w:lineRule="auto" w:line="240" w:beforeAutospacing="1" w:after="0"/>
-              <w:jc w:val="left"/>
-              <w:rPr>
-                <w:rFonts w:eastAsia="Times New Roman" w:cs="Calibri" w:cstheme="minorHAnsi"/>
-                <w:lang w:eastAsia="lv-LV"/>
-              </w:rPr>
-            </w:pPr>
-            <w:r>
-              <w:rPr>
-                <w:rFonts w:eastAsia="Times New Roman" w:cs="Calibri" w:cstheme="minorHAnsi"/>
-                <w:kern w:val="0"/>
-                <w:sz w:val="22"/>
-                <w:szCs w:val="22"/>
-                <w:lang w:val="lv-LV" w:eastAsia="lv-LV" w:bidi="ar-SA"/>
-              </w:rPr>
-              <w:t>Primary key ID (in dimensions) </w:t>
+            <w:tcW w:w="1601" w:type="dxa"/>
+            <w:tcBorders/>
+          </w:tcPr>
+          <w:p>
+            <w:pPr>
+              <w:pStyle w:val="Normal"/>
+              <w:widowControl/>
+              <w:suppressAutoHyphens w:val="true"/>
+              <w:spacing w:lineRule="auto" w:line="240" w:beforeAutospacing="1" w:after="0"/>
+              <w:jc w:val="left"/>
+              <w:rPr>
+                <w:rFonts w:eastAsia="Times New Roman" w:cs="Calibri" w:cstheme="minorHAnsi"/>
+                <w:lang w:eastAsia="lv-LV"/>
+              </w:rPr>
+            </w:pPr>
+            <w:r>
+              <w:rPr>
+                <w:rFonts w:eastAsia="Times New Roman" w:cs="Calibri" w:cstheme="minorHAnsi"/>
+                <w:kern w:val="0"/>
+                <w:sz w:val="22"/>
+                <w:szCs w:val="22"/>
+                <w:lang w:val="lv-LV" w:eastAsia="lv-LV" w:bidi="ar-SA"/>
+              </w:rPr>
+              <w:t>Primary key ID (in dimensions)</w:t>
             </w:r>
           </w:p>
         </w:tc>
@@ -1274,50 +1255,52 @@
             <w:pPr>
               <w:pStyle w:val="Normal"/>
               <w:widowControl/>
-              <w:spacing w:lineRule="auto" w:line="240" w:beforeAutospacing="1" w:after="0"/>
-              <w:jc w:val="left"/>
-              <w:rPr>
-                <w:rFonts w:eastAsia="Times New Roman" w:cs="Calibri" w:cstheme="minorHAnsi"/>
-                <w:lang w:eastAsia="lv-LV"/>
-              </w:rPr>
-            </w:pPr>
-            <w:r>
-              <w:rPr>
-                <w:rFonts w:eastAsia="Times New Roman" w:cs="Calibri" w:cstheme="minorHAnsi"/>
-                <w:kern w:val="0"/>
-                <w:sz w:val="22"/>
-                <w:szCs w:val="22"/>
-                <w:lang w:val="lv-LV" w:eastAsia="lv-LV" w:bidi="ar-SA"/>
-              </w:rPr>
-              <w:t>id&lt;table_name&gt; </w:t>
-            </w:r>
-          </w:p>
-        </w:tc>
-        <w:tc>
-          <w:tcPr>
-            <w:tcW w:w="3086" w:type="dxa"/>
-            <w:tcBorders/>
-          </w:tcPr>
-          <w:p>
-            <w:pPr>
-              <w:pStyle w:val="Normal"/>
-              <w:widowControl/>
-              <w:spacing w:lineRule="auto" w:line="240" w:beforeAutospacing="1" w:after="0"/>
-              <w:jc w:val="left"/>
-              <w:rPr>
-                <w:rFonts w:eastAsia="Times New Roman" w:cs="Calibri" w:cstheme="minorHAnsi"/>
-                <w:lang w:eastAsia="lv-LV"/>
-              </w:rPr>
-            </w:pPr>
-            <w:r>
-              <w:rPr>
-                <w:rFonts w:eastAsia="Times New Roman" w:cs="Calibri" w:cstheme="minorHAnsi"/>
-                <w:kern w:val="0"/>
-                <w:sz w:val="22"/>
-                <w:szCs w:val="22"/>
-                <w:lang w:val="lv-LV" w:eastAsia="lv-LV" w:bidi="ar-SA"/>
-              </w:rPr>
-              <w:t>idd_pol_policy </w:t>
+              <w:suppressAutoHyphens w:val="true"/>
+              <w:spacing w:lineRule="auto" w:line="240" w:beforeAutospacing="1" w:after="0"/>
+              <w:jc w:val="left"/>
+              <w:rPr>
+                <w:rFonts w:eastAsia="Times New Roman" w:cs="Calibri" w:cstheme="minorHAnsi"/>
+                <w:lang w:eastAsia="lv-LV"/>
+              </w:rPr>
+            </w:pPr>
+            <w:r>
+              <w:rPr>
+                <w:rFonts w:eastAsia="Times New Roman" w:cs="Calibri" w:cstheme="minorHAnsi"/>
+                <w:kern w:val="0"/>
+                <w:sz w:val="22"/>
+                <w:szCs w:val="22"/>
+                <w:lang w:val="lv-LV" w:eastAsia="lv-LV" w:bidi="ar-SA"/>
+              </w:rPr>
+              <w:t>id&lt;table_name&gt;</w:t>
+            </w:r>
+          </w:p>
+        </w:tc>
+        <w:tc>
+          <w:tcPr>
+            <w:tcW w:w="3087" w:type="dxa"/>
+            <w:tcBorders/>
+          </w:tcPr>
+          <w:p>
+            <w:pPr>
+              <w:pStyle w:val="Normal"/>
+              <w:widowControl/>
+              <w:suppressAutoHyphens w:val="true"/>
+              <w:spacing w:lineRule="auto" w:line="240" w:beforeAutospacing="1" w:after="0"/>
+              <w:jc w:val="left"/>
+              <w:rPr>
+                <w:rFonts w:eastAsia="Times New Roman" w:cs="Calibri" w:cstheme="minorHAnsi"/>
+                <w:lang w:eastAsia="lv-LV"/>
+              </w:rPr>
+            </w:pPr>
+            <w:r>
+              <w:rPr>
+                <w:rFonts w:eastAsia="Times New Roman" w:cs="Calibri" w:cstheme="minorHAnsi"/>
+                <w:kern w:val="0"/>
+                <w:sz w:val="22"/>
+                <w:szCs w:val="22"/>
+                <w:lang w:val="lv-LV" w:eastAsia="lv-LV" w:bidi="ar-SA"/>
+              </w:rPr>
+              <w:t>idd_pol_policy</w:t>
             </w:r>
           </w:p>
         </w:tc>
@@ -1326,29 +1309,30 @@
         <w:trPr/>
         <w:tc>
           <w:tcPr>
-            <w:tcW w:w="1602" w:type="dxa"/>
-            <w:tcBorders/>
-          </w:tcPr>
-          <w:p>
-            <w:pPr>
-              <w:pStyle w:val="Normal"/>
-              <w:widowControl/>
-              <w:spacing w:lineRule="auto" w:line="240" w:beforeAutospacing="1" w:after="0"/>
-              <w:jc w:val="left"/>
-              <w:rPr>
-                <w:rFonts w:eastAsia="Times New Roman" w:cs="Calibri" w:cstheme="minorHAnsi"/>
-                <w:lang w:eastAsia="lv-LV"/>
-              </w:rPr>
-            </w:pPr>
-            <w:r>
-              <w:rPr>
-                <w:rFonts w:eastAsia="Times New Roman" w:cs="Calibri" w:cstheme="minorHAnsi"/>
-                <w:kern w:val="0"/>
-                <w:sz w:val="22"/>
-                <w:szCs w:val="22"/>
-                <w:lang w:val="lv-LV" w:eastAsia="lv-LV" w:bidi="ar-SA"/>
-              </w:rPr>
-              <w:t>Foreign key ID </w:t>
+            <w:tcW w:w="1601" w:type="dxa"/>
+            <w:tcBorders/>
+          </w:tcPr>
+          <w:p>
+            <w:pPr>
+              <w:pStyle w:val="Normal"/>
+              <w:widowControl/>
+              <w:suppressAutoHyphens w:val="true"/>
+              <w:spacing w:lineRule="auto" w:line="240" w:beforeAutospacing="1" w:after="0"/>
+              <w:jc w:val="left"/>
+              <w:rPr>
+                <w:rFonts w:eastAsia="Times New Roman" w:cs="Calibri" w:cstheme="minorHAnsi"/>
+                <w:lang w:eastAsia="lv-LV"/>
+              </w:rPr>
+            </w:pPr>
+            <w:r>
+              <w:rPr>
+                <w:rFonts w:eastAsia="Times New Roman" w:cs="Calibri" w:cstheme="minorHAnsi"/>
+                <w:kern w:val="0"/>
+                <w:sz w:val="22"/>
+                <w:szCs w:val="22"/>
+                <w:lang w:val="lv-LV" w:eastAsia="lv-LV" w:bidi="ar-SA"/>
+              </w:rPr>
+              <w:t>Foreign key ID</w:t>
             </w:r>
           </w:p>
         </w:tc>
@@ -1361,50 +1345,52 @@
             <w:pPr>
               <w:pStyle w:val="Normal"/>
               <w:widowControl/>
-              <w:spacing w:lineRule="auto" w:line="240" w:beforeAutospacing="1" w:after="0"/>
-              <w:jc w:val="left"/>
-              <w:rPr>
-                <w:rFonts w:eastAsia="Times New Roman" w:cs="Calibri" w:cstheme="minorHAnsi"/>
-                <w:lang w:eastAsia="lv-LV"/>
-              </w:rPr>
-            </w:pPr>
-            <w:r>
-              <w:rPr>
-                <w:rFonts w:eastAsia="Times New Roman" w:cs="Calibri" w:cstheme="minorHAnsi"/>
-                <w:kern w:val="0"/>
-                <w:sz w:val="22"/>
-                <w:szCs w:val="22"/>
-                <w:lang w:val="lv-LV" w:eastAsia="lv-LV" w:bidi="ar-SA"/>
-              </w:rPr>
-              <w:t>id&lt;foreign_table_name&gt; </w:t>
-            </w:r>
-          </w:p>
-        </w:tc>
-        <w:tc>
-          <w:tcPr>
-            <w:tcW w:w="3086" w:type="dxa"/>
-            <w:tcBorders/>
-          </w:tcPr>
-          <w:p>
-            <w:pPr>
-              <w:pStyle w:val="Normal"/>
-              <w:widowControl/>
-              <w:spacing w:lineRule="auto" w:line="240" w:beforeAutospacing="1" w:after="0"/>
-              <w:jc w:val="left"/>
-              <w:rPr>
-                <w:rFonts w:eastAsia="Times New Roman" w:cs="Calibri" w:cstheme="minorHAnsi"/>
-                <w:lang w:eastAsia="lv-LV"/>
-              </w:rPr>
-            </w:pPr>
-            <w:r>
-              <w:rPr>
-                <w:rFonts w:eastAsia="Times New Roman" w:cs="Calibri" w:cstheme="minorHAnsi"/>
-                <w:kern w:val="0"/>
-                <w:sz w:val="22"/>
-                <w:szCs w:val="22"/>
-                <w:lang w:val="lv-LV" w:eastAsia="lv-LV" w:bidi="ar-SA"/>
-              </w:rPr>
-              <w:t>idd_wh_date </w:t>
+              <w:suppressAutoHyphens w:val="true"/>
+              <w:spacing w:lineRule="auto" w:line="240" w:beforeAutospacing="1" w:after="0"/>
+              <w:jc w:val="left"/>
+              <w:rPr>
+                <w:rFonts w:eastAsia="Times New Roman" w:cs="Calibri" w:cstheme="minorHAnsi"/>
+                <w:lang w:eastAsia="lv-LV"/>
+              </w:rPr>
+            </w:pPr>
+            <w:r>
+              <w:rPr>
+                <w:rFonts w:eastAsia="Times New Roman" w:cs="Calibri" w:cstheme="minorHAnsi"/>
+                <w:kern w:val="0"/>
+                <w:sz w:val="22"/>
+                <w:szCs w:val="22"/>
+                <w:lang w:val="lv-LV" w:eastAsia="lv-LV" w:bidi="ar-SA"/>
+              </w:rPr>
+              <w:t>id&lt;foreign_table_name&gt;</w:t>
+            </w:r>
+          </w:p>
+        </w:tc>
+        <w:tc>
+          <w:tcPr>
+            <w:tcW w:w="3087" w:type="dxa"/>
+            <w:tcBorders/>
+          </w:tcPr>
+          <w:p>
+            <w:pPr>
+              <w:pStyle w:val="Normal"/>
+              <w:widowControl/>
+              <w:suppressAutoHyphens w:val="true"/>
+              <w:spacing w:lineRule="auto" w:line="240" w:beforeAutospacing="1" w:after="0"/>
+              <w:jc w:val="left"/>
+              <w:rPr>
+                <w:rFonts w:eastAsia="Times New Roman" w:cs="Calibri" w:cstheme="minorHAnsi"/>
+                <w:lang w:eastAsia="lv-LV"/>
+              </w:rPr>
+            </w:pPr>
+            <w:r>
+              <w:rPr>
+                <w:rFonts w:eastAsia="Times New Roman" w:cs="Calibri" w:cstheme="minorHAnsi"/>
+                <w:kern w:val="0"/>
+                <w:sz w:val="22"/>
+                <w:szCs w:val="22"/>
+                <w:lang w:val="lv-LV" w:eastAsia="lv-LV" w:bidi="ar-SA"/>
+              </w:rPr>
+              <w:t>idd_wh_date</w:t>
             </w:r>
           </w:p>
         </w:tc>
@@ -1413,13 +1399,14 @@
         <w:trPr/>
         <w:tc>
           <w:tcPr>
-            <w:tcW w:w="1602" w:type="dxa"/>
-            <w:tcBorders/>
-          </w:tcPr>
-          <w:p>
-            <w:pPr>
-              <w:pStyle w:val="Normal"/>
-              <w:widowControl/>
+            <w:tcW w:w="1601" w:type="dxa"/>
+            <w:tcBorders/>
+          </w:tcPr>
+          <w:p>
+            <w:pPr>
+              <w:pStyle w:val="Normal"/>
+              <w:widowControl/>
+              <w:suppressAutoHyphens w:val="true"/>
               <w:spacing w:lineRule="auto" w:line="240" w:beforeAutospacing="1" w:after="0"/>
               <w:jc w:val="left"/>
               <w:rPr>
@@ -1448,6 +1435,7 @@
             <w:pPr>
               <w:pStyle w:val="Normal"/>
               <w:widowControl/>
+              <w:suppressAutoHyphens w:val="true"/>
               <w:spacing w:lineRule="auto" w:line="240" w:beforeAutospacing="1" w:afterAutospacing="1"/>
               <w:jc w:val="left"/>
               <w:rPr>
@@ -1463,41 +1451,43 @@
                 <w:szCs w:val="22"/>
                 <w:lang w:val="lv-LV" w:eastAsia="lv-LV" w:bidi="ar-SA"/>
               </w:rPr>
-              <w:t>id&lt;foreign_table_name&gt;__&lt;context&gt; </w:t>
-            </w:r>
-          </w:p>
-          <w:p>
-            <w:pPr>
-              <w:pStyle w:val="Normal"/>
-              <w:widowControl/>
-              <w:spacing w:lineRule="auto" w:line="240" w:beforeAutospacing="1" w:after="0"/>
-              <w:jc w:val="left"/>
-              <w:rPr>
-                <w:rFonts w:eastAsia="Times New Roman" w:cs="Calibri" w:cstheme="minorHAnsi"/>
-                <w:lang w:eastAsia="lv-LV"/>
-              </w:rPr>
-            </w:pPr>
-            <w:r>
-              <w:rPr>
-                <w:rFonts w:eastAsia="Times New Roman" w:cs="Calibri" w:cstheme="minorHAnsi"/>
-                <w:kern w:val="0"/>
-                <w:sz w:val="22"/>
-                <w:szCs w:val="22"/>
-                <w:lang w:val="lv-LV" w:eastAsia="lv-LV" w:bidi="ar-SA"/>
-              </w:rPr>
-              <w:t>  </w:t>
-            </w:r>
-          </w:p>
-        </w:tc>
-        <w:tc>
-          <w:tcPr>
-            <w:tcW w:w="3086" w:type="dxa"/>
-            <w:tcBorders/>
-          </w:tcPr>
-          <w:p>
-            <w:pPr>
-              <w:pStyle w:val="Normal"/>
-              <w:widowControl/>
+              <w:t>id&lt;foreign_table_name&gt;__&lt;context&gt;</w:t>
+            </w:r>
+          </w:p>
+          <w:p>
+            <w:pPr>
+              <w:pStyle w:val="Normal"/>
+              <w:widowControl/>
+              <w:suppressAutoHyphens w:val="true"/>
+              <w:spacing w:lineRule="auto" w:line="240" w:beforeAutospacing="1" w:after="0"/>
+              <w:jc w:val="left"/>
+              <w:rPr>
+                <w:rFonts w:eastAsia="Times New Roman" w:cs="Calibri" w:cstheme="minorHAnsi"/>
+                <w:lang w:eastAsia="lv-LV"/>
+              </w:rPr>
+            </w:pPr>
+            <w:r>
+              <w:rPr>
+                <w:rFonts w:eastAsia="Times New Roman" w:cs="Calibri" w:cstheme="minorHAnsi"/>
+                <w:kern w:val="0"/>
+                <w:sz w:val="22"/>
+                <w:szCs w:val="22"/>
+                <w:lang w:val="lv-LV" w:eastAsia="lv-LV" w:bidi="ar-SA"/>
+              </w:rPr>
+              <w:t> </w:t>
+            </w:r>
+          </w:p>
+        </w:tc>
+        <w:tc>
+          <w:tcPr>
+            <w:tcW w:w="3087" w:type="dxa"/>
+            <w:tcBorders/>
+          </w:tcPr>
+          <w:p>
+            <w:pPr>
+              <w:pStyle w:val="Normal"/>
+              <w:widowControl/>
+              <w:suppressAutoHyphens w:val="true"/>
               <w:spacing w:lineRule="auto" w:line="240" w:beforeAutospacing="1" w:afterAutospacing="1"/>
               <w:jc w:val="left"/>
               <w:rPr>
@@ -1513,13 +1503,14 @@
                 <w:szCs w:val="22"/>
                 <w:lang w:val="lv-LV" w:eastAsia="lv-LV" w:bidi="ar-SA"/>
               </w:rPr>
-              <w:t>idd_wh_date__policy_created </w:t>
-            </w:r>
-          </w:p>
-          <w:p>
-            <w:pPr>
-              <w:pStyle w:val="Normal"/>
-              <w:widowControl/>
+              <w:t>idd_wh_date__policy_created</w:t>
+            </w:r>
+          </w:p>
+          <w:p>
+            <w:pPr>
+              <w:pStyle w:val="Normal"/>
+              <w:widowControl/>
+              <w:suppressAutoHyphens w:val="true"/>
               <w:spacing w:lineRule="auto" w:line="240" w:beforeAutospacing="1" w:afterAutospacing="1"/>
               <w:jc w:val="left"/>
               <w:rPr>
@@ -1542,22 +1533,23 @@
             <w:pPr>
               <w:pStyle w:val="Normal"/>
               <w:widowControl/>
-              <w:spacing w:lineRule="auto" w:line="240" w:beforeAutospacing="1" w:after="0"/>
-              <w:jc w:val="left"/>
-              <w:rPr>
-                <w:rFonts w:eastAsia="Times New Roman" w:cs="Calibri" w:cstheme="minorHAnsi"/>
-                <w:lang w:eastAsia="lv-LV"/>
-              </w:rPr>
-            </w:pPr>
-            <w:r>
-              <w:rPr>
-                <w:rFonts w:eastAsia="Times New Roman" w:cs="Calibri" w:cstheme="minorHAnsi"/>
-                <w:kern w:val="0"/>
-                <w:sz w:val="22"/>
-                <w:szCs w:val="22"/>
-                <w:lang w:val="lv-LV" w:eastAsia="lv-LV" w:bidi="ar-SA"/>
-              </w:rPr>
-              <w:t>idd_wh_date__accounting </w:t>
+              <w:suppressAutoHyphens w:val="true"/>
+              <w:spacing w:lineRule="auto" w:line="240" w:beforeAutospacing="1" w:after="0"/>
+              <w:jc w:val="left"/>
+              <w:rPr>
+                <w:rFonts w:eastAsia="Times New Roman" w:cs="Calibri" w:cstheme="minorHAnsi"/>
+                <w:lang w:eastAsia="lv-LV"/>
+              </w:rPr>
+            </w:pPr>
+            <w:r>
+              <w:rPr>
+                <w:rFonts w:eastAsia="Times New Roman" w:cs="Calibri" w:cstheme="minorHAnsi"/>
+                <w:kern w:val="0"/>
+                <w:sz w:val="22"/>
+                <w:szCs w:val="22"/>
+                <w:lang w:val="lv-LV" w:eastAsia="lv-LV" w:bidi="ar-SA"/>
+              </w:rPr>
+              <w:t>idd_wh_date__accounting</w:t>
             </w:r>
           </w:p>
         </w:tc>
@@ -1566,29 +1558,30 @@
         <w:trPr/>
         <w:tc>
           <w:tcPr>
-            <w:tcW w:w="1602" w:type="dxa"/>
-            <w:tcBorders/>
-          </w:tcPr>
-          <w:p>
-            <w:pPr>
-              <w:pStyle w:val="Normal"/>
-              <w:widowControl/>
-              <w:spacing w:lineRule="auto" w:line="240" w:beforeAutospacing="1" w:after="0"/>
-              <w:jc w:val="left"/>
-              <w:rPr>
-                <w:rFonts w:eastAsia="Times New Roman" w:cs="Calibri" w:cstheme="minorHAnsi"/>
-                <w:lang w:eastAsia="lv-LV"/>
-              </w:rPr>
-            </w:pPr>
-            <w:r>
-              <w:rPr>
-                <w:rFonts w:eastAsia="Times New Roman" w:cs="Calibri" w:cstheme="minorHAnsi"/>
-                <w:kern w:val="0"/>
-                <w:sz w:val="22"/>
-                <w:szCs w:val="22"/>
-                <w:lang w:val="lv-LV" w:eastAsia="lv-LV" w:bidi="ar-SA"/>
-              </w:rPr>
-              <w:t>Dates </w:t>
+            <w:tcW w:w="1601" w:type="dxa"/>
+            <w:tcBorders/>
+          </w:tcPr>
+          <w:p>
+            <w:pPr>
+              <w:pStyle w:val="Normal"/>
+              <w:widowControl/>
+              <w:suppressAutoHyphens w:val="true"/>
+              <w:spacing w:lineRule="auto" w:line="240" w:beforeAutospacing="1" w:after="0"/>
+              <w:jc w:val="left"/>
+              <w:rPr>
+                <w:rFonts w:eastAsia="Times New Roman" w:cs="Calibri" w:cstheme="minorHAnsi"/>
+                <w:lang w:eastAsia="lv-LV"/>
+              </w:rPr>
+            </w:pPr>
+            <w:r>
+              <w:rPr>
+                <w:rFonts w:eastAsia="Times New Roman" w:cs="Calibri" w:cstheme="minorHAnsi"/>
+                <w:kern w:val="0"/>
+                <w:sz w:val="22"/>
+                <w:szCs w:val="22"/>
+                <w:lang w:val="lv-LV" w:eastAsia="lv-LV" w:bidi="ar-SA"/>
+              </w:rPr>
+              <w:t>Dates</w:t>
             </w:r>
           </w:p>
         </w:tc>
@@ -1601,50 +1594,52 @@
             <w:pPr>
               <w:pStyle w:val="Normal"/>
               <w:widowControl/>
-              <w:spacing w:lineRule="auto" w:line="240" w:beforeAutospacing="1" w:after="0"/>
-              <w:jc w:val="left"/>
-              <w:rPr>
-                <w:rFonts w:eastAsia="Times New Roman" w:cs="Calibri" w:cstheme="minorHAnsi"/>
-                <w:lang w:eastAsia="lv-LV"/>
-              </w:rPr>
-            </w:pPr>
-            <w:r>
-              <w:rPr>
-                <w:rFonts w:eastAsia="Times New Roman" w:cs="Calibri" w:cstheme="minorHAnsi"/>
-                <w:kern w:val="0"/>
-                <w:sz w:val="22"/>
-                <w:szCs w:val="22"/>
-                <w:lang w:val="lv-LV" w:eastAsia="lv-LV" w:bidi="ar-SA"/>
-              </w:rPr>
-              <w:t>d_&lt;name&gt; </w:t>
-            </w:r>
-          </w:p>
-        </w:tc>
-        <w:tc>
-          <w:tcPr>
-            <w:tcW w:w="3086" w:type="dxa"/>
-            <w:tcBorders/>
-          </w:tcPr>
-          <w:p>
-            <w:pPr>
-              <w:pStyle w:val="Normal"/>
-              <w:widowControl/>
-              <w:spacing w:lineRule="auto" w:line="240" w:beforeAutospacing="1" w:after="0"/>
-              <w:jc w:val="left"/>
-              <w:rPr>
-                <w:rFonts w:eastAsia="Times New Roman" w:cs="Calibri" w:cstheme="minorHAnsi"/>
-                <w:lang w:eastAsia="lv-LV"/>
-              </w:rPr>
-            </w:pPr>
-            <w:r>
-              <w:rPr>
-                <w:rFonts w:eastAsia="Times New Roman" w:cs="Calibri" w:cstheme="minorHAnsi"/>
-                <w:kern w:val="0"/>
-                <w:sz w:val="22"/>
-                <w:szCs w:val="22"/>
-                <w:lang w:val="lv-LV" w:eastAsia="lv-LV" w:bidi="ar-SA"/>
-              </w:rPr>
-              <w:t>d_created </w:t>
+              <w:suppressAutoHyphens w:val="true"/>
+              <w:spacing w:lineRule="auto" w:line="240" w:beforeAutospacing="1" w:after="0"/>
+              <w:jc w:val="left"/>
+              <w:rPr>
+                <w:rFonts w:eastAsia="Times New Roman" w:cs="Calibri" w:cstheme="minorHAnsi"/>
+                <w:lang w:eastAsia="lv-LV"/>
+              </w:rPr>
+            </w:pPr>
+            <w:r>
+              <w:rPr>
+                <w:rFonts w:eastAsia="Times New Roman" w:cs="Calibri" w:cstheme="minorHAnsi"/>
+                <w:kern w:val="0"/>
+                <w:sz w:val="22"/>
+                <w:szCs w:val="22"/>
+                <w:lang w:val="lv-LV" w:eastAsia="lv-LV" w:bidi="ar-SA"/>
+              </w:rPr>
+              <w:t>d_&lt;name&gt;</w:t>
+            </w:r>
+          </w:p>
+        </w:tc>
+        <w:tc>
+          <w:tcPr>
+            <w:tcW w:w="3087" w:type="dxa"/>
+            <w:tcBorders/>
+          </w:tcPr>
+          <w:p>
+            <w:pPr>
+              <w:pStyle w:val="Normal"/>
+              <w:widowControl/>
+              <w:suppressAutoHyphens w:val="true"/>
+              <w:spacing w:lineRule="auto" w:line="240" w:beforeAutospacing="1" w:after="0"/>
+              <w:jc w:val="left"/>
+              <w:rPr>
+                <w:rFonts w:eastAsia="Times New Roman" w:cs="Calibri" w:cstheme="minorHAnsi"/>
+                <w:lang w:eastAsia="lv-LV"/>
+              </w:rPr>
+            </w:pPr>
+            <w:r>
+              <w:rPr>
+                <w:rFonts w:eastAsia="Times New Roman" w:cs="Calibri" w:cstheme="minorHAnsi"/>
+                <w:kern w:val="0"/>
+                <w:sz w:val="22"/>
+                <w:szCs w:val="22"/>
+                <w:lang w:val="lv-LV" w:eastAsia="lv-LV" w:bidi="ar-SA"/>
+              </w:rPr>
+              <w:t>d_created</w:t>
             </w:r>
           </w:p>
         </w:tc>
@@ -1653,29 +1648,30 @@
         <w:trPr/>
         <w:tc>
           <w:tcPr>
-            <w:tcW w:w="1602" w:type="dxa"/>
-            <w:tcBorders/>
-          </w:tcPr>
-          <w:p>
-            <w:pPr>
-              <w:pStyle w:val="Normal"/>
-              <w:widowControl/>
-              <w:spacing w:lineRule="auto" w:line="240" w:beforeAutospacing="1" w:after="0"/>
-              <w:jc w:val="left"/>
-              <w:rPr>
-                <w:rFonts w:eastAsia="Times New Roman" w:cs="Calibri" w:cstheme="minorHAnsi"/>
-                <w:lang w:eastAsia="lv-LV"/>
-              </w:rPr>
-            </w:pPr>
-            <w:r>
-              <w:rPr>
-                <w:rFonts w:eastAsia="Times New Roman" w:cs="Calibri" w:cstheme="minorHAnsi"/>
-                <w:kern w:val="0"/>
-                <w:sz w:val="22"/>
-                <w:szCs w:val="22"/>
-                <w:lang w:val="lv-LV" w:eastAsia="lv-LV" w:bidi="ar-SA"/>
-              </w:rPr>
-              <w:t>Datetime </w:t>
+            <w:tcW w:w="1601" w:type="dxa"/>
+            <w:tcBorders/>
+          </w:tcPr>
+          <w:p>
+            <w:pPr>
+              <w:pStyle w:val="Normal"/>
+              <w:widowControl/>
+              <w:suppressAutoHyphens w:val="true"/>
+              <w:spacing w:lineRule="auto" w:line="240" w:beforeAutospacing="1" w:after="0"/>
+              <w:jc w:val="left"/>
+              <w:rPr>
+                <w:rFonts w:eastAsia="Times New Roman" w:cs="Calibri" w:cstheme="minorHAnsi"/>
+                <w:lang w:eastAsia="lv-LV"/>
+              </w:rPr>
+            </w:pPr>
+            <w:r>
+              <w:rPr>
+                <w:rFonts w:eastAsia="Times New Roman" w:cs="Calibri" w:cstheme="minorHAnsi"/>
+                <w:kern w:val="0"/>
+                <w:sz w:val="22"/>
+                <w:szCs w:val="22"/>
+                <w:lang w:val="lv-LV" w:eastAsia="lv-LV" w:bidi="ar-SA"/>
+              </w:rPr>
+              <w:t>Datetime</w:t>
             </w:r>
           </w:p>
         </w:tc>
@@ -1688,50 +1684,52 @@
             <w:pPr>
               <w:pStyle w:val="Normal"/>
               <w:widowControl/>
-              <w:spacing w:lineRule="auto" w:line="240" w:beforeAutospacing="1" w:after="0"/>
-              <w:jc w:val="left"/>
-              <w:rPr>
-                <w:rFonts w:eastAsia="Times New Roman" w:cs="Calibri" w:cstheme="minorHAnsi"/>
-                <w:lang w:eastAsia="lv-LV"/>
-              </w:rPr>
-            </w:pPr>
-            <w:r>
-              <w:rPr>
-                <w:rFonts w:eastAsia="Times New Roman" w:cs="Calibri" w:cstheme="minorHAnsi"/>
-                <w:kern w:val="0"/>
-                <w:sz w:val="22"/>
-                <w:szCs w:val="22"/>
-                <w:lang w:val="lv-LV" w:eastAsia="lv-LV" w:bidi="ar-SA"/>
-              </w:rPr>
-              <w:t>dt_&lt;name&gt; </w:t>
-            </w:r>
-          </w:p>
-        </w:tc>
-        <w:tc>
-          <w:tcPr>
-            <w:tcW w:w="3086" w:type="dxa"/>
-            <w:tcBorders/>
-          </w:tcPr>
-          <w:p>
-            <w:pPr>
-              <w:pStyle w:val="Normal"/>
-              <w:widowControl/>
-              <w:spacing w:lineRule="auto" w:line="240" w:beforeAutospacing="1" w:after="0"/>
-              <w:jc w:val="left"/>
-              <w:rPr>
-                <w:rFonts w:eastAsia="Times New Roman" w:cs="Calibri" w:cstheme="minorHAnsi"/>
-                <w:lang w:eastAsia="lv-LV"/>
-              </w:rPr>
-            </w:pPr>
-            <w:r>
-              <w:rPr>
-                <w:rFonts w:eastAsia="Times New Roman" w:cs="Calibri" w:cstheme="minorHAnsi"/>
-                <w:kern w:val="0"/>
-                <w:sz w:val="22"/>
-                <w:szCs w:val="22"/>
-                <w:lang w:val="lv-LV" w:eastAsia="lv-LV" w:bidi="ar-SA"/>
-              </w:rPr>
-              <w:t>dt_updated </w:t>
+              <w:suppressAutoHyphens w:val="true"/>
+              <w:spacing w:lineRule="auto" w:line="240" w:beforeAutospacing="1" w:after="0"/>
+              <w:jc w:val="left"/>
+              <w:rPr>
+                <w:rFonts w:eastAsia="Times New Roman" w:cs="Calibri" w:cstheme="minorHAnsi"/>
+                <w:lang w:eastAsia="lv-LV"/>
+              </w:rPr>
+            </w:pPr>
+            <w:r>
+              <w:rPr>
+                <w:rFonts w:eastAsia="Times New Roman" w:cs="Calibri" w:cstheme="minorHAnsi"/>
+                <w:kern w:val="0"/>
+                <w:sz w:val="22"/>
+                <w:szCs w:val="22"/>
+                <w:lang w:val="lv-LV" w:eastAsia="lv-LV" w:bidi="ar-SA"/>
+              </w:rPr>
+              <w:t>dt_&lt;name&gt;</w:t>
+            </w:r>
+          </w:p>
+        </w:tc>
+        <w:tc>
+          <w:tcPr>
+            <w:tcW w:w="3087" w:type="dxa"/>
+            <w:tcBorders/>
+          </w:tcPr>
+          <w:p>
+            <w:pPr>
+              <w:pStyle w:val="Normal"/>
+              <w:widowControl/>
+              <w:suppressAutoHyphens w:val="true"/>
+              <w:spacing w:lineRule="auto" w:line="240" w:beforeAutospacing="1" w:after="0"/>
+              <w:jc w:val="left"/>
+              <w:rPr>
+                <w:rFonts w:eastAsia="Times New Roman" w:cs="Calibri" w:cstheme="minorHAnsi"/>
+                <w:lang w:eastAsia="lv-LV"/>
+              </w:rPr>
+            </w:pPr>
+            <w:r>
+              <w:rPr>
+                <w:rFonts w:eastAsia="Times New Roman" w:cs="Calibri" w:cstheme="minorHAnsi"/>
+                <w:kern w:val="0"/>
+                <w:sz w:val="22"/>
+                <w:szCs w:val="22"/>
+                <w:lang w:val="lv-LV" w:eastAsia="lv-LV" w:bidi="ar-SA"/>
+              </w:rPr>
+              <w:t>dt_updated</w:t>
             </w:r>
           </w:p>
         </w:tc>
@@ -1740,13 +1738,14 @@
         <w:trPr/>
         <w:tc>
           <w:tcPr>
-            <w:tcW w:w="1602" w:type="dxa"/>
-            <w:tcBorders/>
-          </w:tcPr>
-          <w:p>
-            <w:pPr>
-              <w:pStyle w:val="Normal"/>
-              <w:widowControl/>
+            <w:tcW w:w="1601" w:type="dxa"/>
+            <w:tcBorders/>
+          </w:tcPr>
+          <w:p>
+            <w:pPr>
+              <w:pStyle w:val="Normal"/>
+              <w:widowControl/>
+              <w:suppressAutoHyphens w:val="true"/>
               <w:spacing w:lineRule="auto" w:line="240" w:before="0" w:after="0"/>
               <w:jc w:val="left"/>
               <w:rPr>
@@ -1775,6 +1774,7 @@
             <w:pPr>
               <w:pStyle w:val="Normal"/>
               <w:widowControl/>
+              <w:suppressAutoHyphens w:val="true"/>
               <w:spacing w:lineRule="auto" w:line="240" w:before="0" w:after="0"/>
               <w:jc w:val="left"/>
               <w:rPr>
@@ -1796,13 +1796,14 @@
         </w:tc>
         <w:tc>
           <w:tcPr>
-            <w:tcW w:w="3086" w:type="dxa"/>
-            <w:tcBorders/>
-          </w:tcPr>
-          <w:p>
-            <w:pPr>
-              <w:pStyle w:val="Normal"/>
-              <w:widowControl/>
+            <w:tcW w:w="3087" w:type="dxa"/>
+            <w:tcBorders/>
+          </w:tcPr>
+          <w:p>
+            <w:pPr>
+              <w:pStyle w:val="Normal"/>
+              <w:widowControl/>
+              <w:suppressAutoHyphens w:val="true"/>
               <w:spacing w:lineRule="auto" w:line="240" w:before="0" w:after="0"/>
               <w:jc w:val="left"/>
               <w:rPr>
@@ -1827,29 +1828,30 @@
         <w:trPr/>
         <w:tc>
           <w:tcPr>
-            <w:tcW w:w="1602" w:type="dxa"/>
-            <w:tcBorders/>
-          </w:tcPr>
-          <w:p>
-            <w:pPr>
-              <w:pStyle w:val="Normal"/>
-              <w:widowControl/>
-              <w:spacing w:lineRule="auto" w:line="240" w:beforeAutospacing="1" w:after="0"/>
-              <w:jc w:val="left"/>
-              <w:rPr>
-                <w:rFonts w:eastAsia="Times New Roman" w:cs="Calibri" w:cstheme="minorHAnsi"/>
-                <w:lang w:eastAsia="lv-LV"/>
-              </w:rPr>
-            </w:pPr>
-            <w:r>
-              <w:rPr>
-                <w:rFonts w:eastAsia="Times New Roman" w:cs="Calibri" w:cstheme="minorHAnsi"/>
-                <w:kern w:val="0"/>
-                <w:sz w:val="22"/>
-                <w:szCs w:val="22"/>
-                <w:lang w:val="lv-LV" w:eastAsia="lv-LV" w:bidi="ar-SA"/>
-              </w:rPr>
-              <w:t>Amounts </w:t>
+            <w:tcW w:w="1601" w:type="dxa"/>
+            <w:tcBorders/>
+          </w:tcPr>
+          <w:p>
+            <w:pPr>
+              <w:pStyle w:val="Normal"/>
+              <w:widowControl/>
+              <w:suppressAutoHyphens w:val="true"/>
+              <w:spacing w:lineRule="auto" w:line="240" w:beforeAutospacing="1" w:after="0"/>
+              <w:jc w:val="left"/>
+              <w:rPr>
+                <w:rFonts w:eastAsia="Times New Roman" w:cs="Calibri" w:cstheme="minorHAnsi"/>
+                <w:lang w:eastAsia="lv-LV"/>
+              </w:rPr>
+            </w:pPr>
+            <w:r>
+              <w:rPr>
+                <w:rFonts w:eastAsia="Times New Roman" w:cs="Calibri" w:cstheme="minorHAnsi"/>
+                <w:kern w:val="0"/>
+                <w:sz w:val="22"/>
+                <w:szCs w:val="22"/>
+                <w:lang w:val="lv-LV" w:eastAsia="lv-LV" w:bidi="ar-SA"/>
+              </w:rPr>
+              <w:t>Amounts</w:t>
             </w:r>
           </w:p>
         </w:tc>
@@ -1862,34 +1864,36 @@
             <w:pPr>
               <w:pStyle w:val="Normal"/>
               <w:widowControl/>
-              <w:spacing w:lineRule="auto" w:line="240" w:beforeAutospacing="1" w:after="0"/>
-              <w:jc w:val="left"/>
-              <w:rPr>
-                <w:rFonts w:eastAsia="Times New Roman" w:cs="Calibri" w:cstheme="minorHAnsi"/>
-                <w:lang w:eastAsia="lv-LV"/>
-              </w:rPr>
-            </w:pPr>
-            <w:r>
-              <w:rPr>
-                <w:rFonts w:eastAsia="Times New Roman" w:cs="Calibri" w:cstheme="minorHAnsi"/>
-                <w:kern w:val="0"/>
-                <w:sz w:val="22"/>
-                <w:szCs w:val="22"/>
-                <w:lang w:val="lv-LV" w:eastAsia="lv-LV" w:bidi="ar-SA"/>
-              </w:rPr>
-              <w:t>amt_&lt;name&gt;_&lt;additional context&gt;_&lt;[group]&gt; </w:t>
-            </w:r>
-          </w:p>
-        </w:tc>
-        <w:tc>
-          <w:tcPr>
-            <w:tcW w:w="3086" w:type="dxa"/>
-            <w:tcBorders/>
-          </w:tcPr>
-          <w:p>
-            <w:pPr>
-              <w:pStyle w:val="Normal"/>
-              <w:widowControl/>
+              <w:suppressAutoHyphens w:val="true"/>
+              <w:spacing w:lineRule="auto" w:line="240" w:beforeAutospacing="1" w:after="0"/>
+              <w:jc w:val="left"/>
+              <w:rPr>
+                <w:rFonts w:eastAsia="Times New Roman" w:cs="Calibri" w:cstheme="minorHAnsi"/>
+                <w:lang w:eastAsia="lv-LV"/>
+              </w:rPr>
+            </w:pPr>
+            <w:r>
+              <w:rPr>
+                <w:rFonts w:eastAsia="Times New Roman" w:cs="Calibri" w:cstheme="minorHAnsi"/>
+                <w:kern w:val="0"/>
+                <w:sz w:val="22"/>
+                <w:szCs w:val="22"/>
+                <w:lang w:val="lv-LV" w:eastAsia="lv-LV" w:bidi="ar-SA"/>
+              </w:rPr>
+              <w:t>amt_&lt;name&gt;_&lt;additional context&gt;_&lt;[group]&gt;</w:t>
+            </w:r>
+          </w:p>
+        </w:tc>
+        <w:tc>
+          <w:tcPr>
+            <w:tcW w:w="3087" w:type="dxa"/>
+            <w:tcBorders/>
+          </w:tcPr>
+          <w:p>
+            <w:pPr>
+              <w:pStyle w:val="Normal"/>
+              <w:widowControl/>
+              <w:suppressAutoHyphens w:val="true"/>
               <w:spacing w:lineRule="auto" w:line="240" w:beforeAutospacing="1" w:afterAutospacing="1"/>
               <w:jc w:val="left"/>
               <w:rPr>
@@ -1905,29 +1909,30 @@
                 <w:szCs w:val="22"/>
                 <w:lang w:val="lv-LV" w:eastAsia="lv-LV" w:bidi="ar-SA"/>
               </w:rPr>
-              <w:t>amt_invoice </w:t>
-            </w:r>
-          </w:p>
-          <w:p>
-            <w:pPr>
-              <w:pStyle w:val="Normal"/>
-              <w:widowControl/>
-              <w:spacing w:lineRule="auto" w:line="240" w:beforeAutospacing="1" w:after="0"/>
-              <w:jc w:val="left"/>
-              <w:rPr>
-                <w:rFonts w:eastAsia="Times New Roman" w:cs="Calibri" w:cstheme="minorHAnsi"/>
-                <w:lang w:eastAsia="lv-LV"/>
-              </w:rPr>
-            </w:pPr>
-            <w:r>
-              <w:rPr>
-                <w:rFonts w:eastAsia="Times New Roman" w:cs="Calibri" w:cstheme="minorHAnsi"/>
-                <w:kern w:val="0"/>
-                <w:sz w:val="22"/>
-                <w:szCs w:val="22"/>
-                <w:lang w:val="lv-LV" w:eastAsia="lv-LV" w:bidi="ar-SA"/>
-              </w:rPr>
-              <w:t>amt_invoice_group </w:t>
+              <w:t>amt_invoice</w:t>
+            </w:r>
+          </w:p>
+          <w:p>
+            <w:pPr>
+              <w:pStyle w:val="Normal"/>
+              <w:widowControl/>
+              <w:suppressAutoHyphens w:val="true"/>
+              <w:spacing w:lineRule="auto" w:line="240" w:beforeAutospacing="1" w:after="0"/>
+              <w:jc w:val="left"/>
+              <w:rPr>
+                <w:rFonts w:eastAsia="Times New Roman" w:cs="Calibri" w:cstheme="minorHAnsi"/>
+                <w:lang w:eastAsia="lv-LV"/>
+              </w:rPr>
+            </w:pPr>
+            <w:r>
+              <w:rPr>
+                <w:rFonts w:eastAsia="Times New Roman" w:cs="Calibri" w:cstheme="minorHAnsi"/>
+                <w:kern w:val="0"/>
+                <w:sz w:val="22"/>
+                <w:szCs w:val="22"/>
+                <w:lang w:val="lv-LV" w:eastAsia="lv-LV" w:bidi="ar-SA"/>
+              </w:rPr>
+              <w:t>amt_invoice_group</w:t>
             </w:r>
           </w:p>
         </w:tc>
@@ -1936,29 +1941,30 @@
         <w:trPr/>
         <w:tc>
           <w:tcPr>
-            <w:tcW w:w="1602" w:type="dxa"/>
-            <w:tcBorders/>
-          </w:tcPr>
-          <w:p>
-            <w:pPr>
-              <w:pStyle w:val="Normal"/>
-              <w:widowControl/>
-              <w:spacing w:lineRule="auto" w:line="240" w:beforeAutospacing="1" w:after="0"/>
-              <w:jc w:val="left"/>
-              <w:rPr>
-                <w:rFonts w:eastAsia="Times New Roman" w:cs="Calibri" w:cstheme="minorHAnsi"/>
-                <w:lang w:eastAsia="lv-LV"/>
-              </w:rPr>
-            </w:pPr>
-            <w:r>
-              <w:rPr>
-                <w:rFonts w:eastAsia="Times New Roman" w:cs="Calibri" w:cstheme="minorHAnsi"/>
-                <w:kern w:val="0"/>
-                <w:sz w:val="22"/>
-                <w:szCs w:val="22"/>
-                <w:lang w:val="lv-LV" w:eastAsia="lv-LV" w:bidi="ar-SA"/>
-              </w:rPr>
-              <w:t>Quantities </w:t>
+            <w:tcW w:w="1601" w:type="dxa"/>
+            <w:tcBorders/>
+          </w:tcPr>
+          <w:p>
+            <w:pPr>
+              <w:pStyle w:val="Normal"/>
+              <w:widowControl/>
+              <w:suppressAutoHyphens w:val="true"/>
+              <w:spacing w:lineRule="auto" w:line="240" w:beforeAutospacing="1" w:after="0"/>
+              <w:jc w:val="left"/>
+              <w:rPr>
+                <w:rFonts w:eastAsia="Times New Roman" w:cs="Calibri" w:cstheme="minorHAnsi"/>
+                <w:lang w:eastAsia="lv-LV"/>
+              </w:rPr>
+            </w:pPr>
+            <w:r>
+              <w:rPr>
+                <w:rFonts w:eastAsia="Times New Roman" w:cs="Calibri" w:cstheme="minorHAnsi"/>
+                <w:kern w:val="0"/>
+                <w:sz w:val="22"/>
+                <w:szCs w:val="22"/>
+                <w:lang w:val="lv-LV" w:eastAsia="lv-LV" w:bidi="ar-SA"/>
+              </w:rPr>
+              <w:t>Quantities</w:t>
             </w:r>
           </w:p>
         </w:tc>
@@ -1971,34 +1977,36 @@
             <w:pPr>
               <w:pStyle w:val="Normal"/>
               <w:widowControl/>
-              <w:spacing w:lineRule="auto" w:line="240" w:beforeAutospacing="1" w:after="0"/>
-              <w:jc w:val="left"/>
-              <w:rPr>
-                <w:rFonts w:eastAsia="Times New Roman" w:cs="Calibri" w:cstheme="minorHAnsi"/>
-                <w:lang w:eastAsia="lv-LV"/>
-              </w:rPr>
-            </w:pPr>
-            <w:r>
-              <w:rPr>
-                <w:rFonts w:eastAsia="Times New Roman" w:cs="Calibri" w:cstheme="minorHAnsi"/>
-                <w:kern w:val="0"/>
-                <w:sz w:val="22"/>
-                <w:szCs w:val="22"/>
-                <w:lang w:val="lv-LV" w:eastAsia="lv-LV" w:bidi="ar-SA"/>
-              </w:rPr>
-              <w:t>qty_&lt;name&gt;_&lt;additional context&gt; </w:t>
-            </w:r>
-          </w:p>
-        </w:tc>
-        <w:tc>
-          <w:tcPr>
-            <w:tcW w:w="3086" w:type="dxa"/>
-            <w:tcBorders/>
-          </w:tcPr>
-          <w:p>
-            <w:pPr>
-              <w:pStyle w:val="Normal"/>
-              <w:widowControl/>
+              <w:suppressAutoHyphens w:val="true"/>
+              <w:spacing w:lineRule="auto" w:line="240" w:beforeAutospacing="1" w:after="0"/>
+              <w:jc w:val="left"/>
+              <w:rPr>
+                <w:rFonts w:eastAsia="Times New Roman" w:cs="Calibri" w:cstheme="minorHAnsi"/>
+                <w:lang w:eastAsia="lv-LV"/>
+              </w:rPr>
+            </w:pPr>
+            <w:r>
+              <w:rPr>
+                <w:rFonts w:eastAsia="Times New Roman" w:cs="Calibri" w:cstheme="minorHAnsi"/>
+                <w:kern w:val="0"/>
+                <w:sz w:val="22"/>
+                <w:szCs w:val="22"/>
+                <w:lang w:val="lv-LV" w:eastAsia="lv-LV" w:bidi="ar-SA"/>
+              </w:rPr>
+              <w:t>qty_&lt;name&gt;_&lt;additional context&gt;</w:t>
+            </w:r>
+          </w:p>
+        </w:tc>
+        <w:tc>
+          <w:tcPr>
+            <w:tcW w:w="3087" w:type="dxa"/>
+            <w:tcBorders/>
+          </w:tcPr>
+          <w:p>
+            <w:pPr>
+              <w:pStyle w:val="Normal"/>
+              <w:widowControl/>
+              <w:suppressAutoHyphens w:val="true"/>
               <w:spacing w:lineRule="auto" w:line="240" w:beforeAutospacing="1" w:afterAutospacing="1"/>
               <w:jc w:val="left"/>
               <w:rPr>
@@ -2014,29 +2022,30 @@
                 <w:szCs w:val="22"/>
                 <w:lang w:val="lv-LV" w:eastAsia="lv-LV" w:bidi="ar-SA"/>
               </w:rPr>
-              <w:t>qty_invoice </w:t>
-            </w:r>
-          </w:p>
-          <w:p>
-            <w:pPr>
-              <w:pStyle w:val="Normal"/>
-              <w:widowControl/>
-              <w:spacing w:lineRule="auto" w:line="240" w:beforeAutospacing="1" w:after="0"/>
-              <w:jc w:val="left"/>
-              <w:rPr>
-                <w:rFonts w:eastAsia="Times New Roman" w:cs="Calibri" w:cstheme="minorHAnsi"/>
-                <w:lang w:eastAsia="lv-LV"/>
-              </w:rPr>
-            </w:pPr>
-            <w:r>
-              <w:rPr>
-                <w:rFonts w:eastAsia="Times New Roman" w:cs="Calibri" w:cstheme="minorHAnsi"/>
-                <w:kern w:val="0"/>
-                <w:sz w:val="22"/>
-                <w:szCs w:val="22"/>
-                <w:lang w:val="lv-LV" w:eastAsia="lv-LV" w:bidi="ar-SA"/>
-              </w:rPr>
-              <w:t>qty_invoice_ytd </w:t>
+              <w:t>qty_invoice</w:t>
+            </w:r>
+          </w:p>
+          <w:p>
+            <w:pPr>
+              <w:pStyle w:val="Normal"/>
+              <w:widowControl/>
+              <w:suppressAutoHyphens w:val="true"/>
+              <w:spacing w:lineRule="auto" w:line="240" w:beforeAutospacing="1" w:after="0"/>
+              <w:jc w:val="left"/>
+              <w:rPr>
+                <w:rFonts w:eastAsia="Times New Roman" w:cs="Calibri" w:cstheme="minorHAnsi"/>
+                <w:lang w:eastAsia="lv-LV"/>
+              </w:rPr>
+            </w:pPr>
+            <w:r>
+              <w:rPr>
+                <w:rFonts w:eastAsia="Times New Roman" w:cs="Calibri" w:cstheme="minorHAnsi"/>
+                <w:kern w:val="0"/>
+                <w:sz w:val="22"/>
+                <w:szCs w:val="22"/>
+                <w:lang w:val="lv-LV" w:eastAsia="lv-LV" w:bidi="ar-SA"/>
+              </w:rPr>
+              <w:t>qty_invoice_ytd</w:t>
             </w:r>
           </w:p>
         </w:tc>
@@ -2045,29 +2054,30 @@
         <w:trPr/>
         <w:tc>
           <w:tcPr>
-            <w:tcW w:w="1602" w:type="dxa"/>
-            <w:tcBorders/>
-          </w:tcPr>
-          <w:p>
-            <w:pPr>
-              <w:pStyle w:val="Normal"/>
-              <w:widowControl/>
-              <w:spacing w:lineRule="auto" w:line="240" w:beforeAutospacing="1" w:after="0"/>
-              <w:jc w:val="left"/>
-              <w:rPr>
-                <w:rFonts w:eastAsia="Times New Roman" w:cs="Calibri" w:cstheme="minorHAnsi"/>
-                <w:lang w:eastAsia="lv-LV"/>
-              </w:rPr>
-            </w:pPr>
-            <w:r>
-              <w:rPr>
-                <w:rFonts w:eastAsia="Times New Roman" w:cs="Calibri" w:cstheme="minorHAnsi"/>
-                <w:kern w:val="0"/>
-                <w:sz w:val="22"/>
-                <w:szCs w:val="22"/>
-                <w:lang w:val="lv-LV" w:eastAsia="lv-LV" w:bidi="ar-SA"/>
-              </w:rPr>
-              <w:t>Counts </w:t>
+            <w:tcW w:w="1601" w:type="dxa"/>
+            <w:tcBorders/>
+          </w:tcPr>
+          <w:p>
+            <w:pPr>
+              <w:pStyle w:val="Normal"/>
+              <w:widowControl/>
+              <w:suppressAutoHyphens w:val="true"/>
+              <w:spacing w:lineRule="auto" w:line="240" w:beforeAutospacing="1" w:after="0"/>
+              <w:jc w:val="left"/>
+              <w:rPr>
+                <w:rFonts w:eastAsia="Times New Roman" w:cs="Calibri" w:cstheme="minorHAnsi"/>
+                <w:lang w:eastAsia="lv-LV"/>
+              </w:rPr>
+            </w:pPr>
+            <w:r>
+              <w:rPr>
+                <w:rFonts w:eastAsia="Times New Roman" w:cs="Calibri" w:cstheme="minorHAnsi"/>
+                <w:kern w:val="0"/>
+                <w:sz w:val="22"/>
+                <w:szCs w:val="22"/>
+                <w:lang w:val="lv-LV" w:eastAsia="lv-LV" w:bidi="ar-SA"/>
+              </w:rPr>
+              <w:t>Counts</w:t>
             </w:r>
           </w:p>
         </w:tc>
@@ -2080,34 +2090,36 @@
             <w:pPr>
               <w:pStyle w:val="Normal"/>
               <w:widowControl/>
-              <w:spacing w:lineRule="auto" w:line="240" w:beforeAutospacing="1" w:after="0"/>
-              <w:jc w:val="left"/>
-              <w:rPr>
-                <w:rFonts w:eastAsia="Times New Roman" w:cs="Calibri" w:cstheme="minorHAnsi"/>
-                <w:lang w:eastAsia="lv-LV"/>
-              </w:rPr>
-            </w:pPr>
-            <w:r>
-              <w:rPr>
-                <w:rFonts w:eastAsia="Times New Roman" w:cs="Calibri" w:cstheme="minorHAnsi"/>
-                <w:kern w:val="0"/>
-                <w:sz w:val="22"/>
-                <w:szCs w:val="22"/>
-                <w:lang w:val="lv-LV" w:eastAsia="lv-LV" w:bidi="ar-SA"/>
-              </w:rPr>
-              <w:t>cnt_&lt;name&gt;_&lt;additional context&gt; </w:t>
-            </w:r>
-          </w:p>
-        </w:tc>
-        <w:tc>
-          <w:tcPr>
-            <w:tcW w:w="3086" w:type="dxa"/>
-            <w:tcBorders/>
-          </w:tcPr>
-          <w:p>
-            <w:pPr>
-              <w:pStyle w:val="Normal"/>
-              <w:widowControl/>
+              <w:suppressAutoHyphens w:val="true"/>
+              <w:spacing w:lineRule="auto" w:line="240" w:beforeAutospacing="1" w:after="0"/>
+              <w:jc w:val="left"/>
+              <w:rPr>
+                <w:rFonts w:eastAsia="Times New Roman" w:cs="Calibri" w:cstheme="minorHAnsi"/>
+                <w:lang w:eastAsia="lv-LV"/>
+              </w:rPr>
+            </w:pPr>
+            <w:r>
+              <w:rPr>
+                <w:rFonts w:eastAsia="Times New Roman" w:cs="Calibri" w:cstheme="minorHAnsi"/>
+                <w:kern w:val="0"/>
+                <w:sz w:val="22"/>
+                <w:szCs w:val="22"/>
+                <w:lang w:val="lv-LV" w:eastAsia="lv-LV" w:bidi="ar-SA"/>
+              </w:rPr>
+              <w:t>cnt_&lt;name&gt;_&lt;additional context&gt;</w:t>
+            </w:r>
+          </w:p>
+        </w:tc>
+        <w:tc>
+          <w:tcPr>
+            <w:tcW w:w="3087" w:type="dxa"/>
+            <w:tcBorders/>
+          </w:tcPr>
+          <w:p>
+            <w:pPr>
+              <w:pStyle w:val="Normal"/>
+              <w:widowControl/>
+              <w:suppressAutoHyphens w:val="true"/>
               <w:spacing w:lineRule="auto" w:line="240" w:beforeAutospacing="1" w:afterAutospacing="1"/>
               <w:jc w:val="left"/>
               <w:rPr>
@@ -2123,29 +2135,30 @@
                 <w:szCs w:val="22"/>
                 <w:lang w:val="lv-LV" w:eastAsia="lv-LV" w:bidi="ar-SA"/>
               </w:rPr>
-              <w:t>cnt_invoices </w:t>
-            </w:r>
-          </w:p>
-          <w:p>
-            <w:pPr>
-              <w:pStyle w:val="Normal"/>
-              <w:widowControl/>
-              <w:spacing w:lineRule="auto" w:line="240" w:beforeAutospacing="1" w:after="0"/>
-              <w:jc w:val="left"/>
-              <w:rPr>
-                <w:rFonts w:eastAsia="Times New Roman" w:cs="Calibri" w:cstheme="minorHAnsi"/>
-                <w:lang w:eastAsia="lv-LV"/>
-              </w:rPr>
-            </w:pPr>
-            <w:r>
-              <w:rPr>
-                <w:rFonts w:eastAsia="Times New Roman" w:cs="Calibri" w:cstheme="minorHAnsi"/>
-                <w:kern w:val="0"/>
-                <w:sz w:val="22"/>
-                <w:szCs w:val="22"/>
-                <w:lang w:val="lv-LV" w:eastAsia="lv-LV" w:bidi="ar-SA"/>
-              </w:rPr>
-              <w:t>cnt_days_approved_to_receive </w:t>
+              <w:t>cnt_invoices</w:t>
+            </w:r>
+          </w:p>
+          <w:p>
+            <w:pPr>
+              <w:pStyle w:val="Normal"/>
+              <w:widowControl/>
+              <w:suppressAutoHyphens w:val="true"/>
+              <w:spacing w:lineRule="auto" w:line="240" w:beforeAutospacing="1" w:after="0"/>
+              <w:jc w:val="left"/>
+              <w:rPr>
+                <w:rFonts w:eastAsia="Times New Roman" w:cs="Calibri" w:cstheme="minorHAnsi"/>
+                <w:lang w:eastAsia="lv-LV"/>
+              </w:rPr>
+            </w:pPr>
+            <w:r>
+              <w:rPr>
+                <w:rFonts w:eastAsia="Times New Roman" w:cs="Calibri" w:cstheme="minorHAnsi"/>
+                <w:kern w:val="0"/>
+                <w:sz w:val="22"/>
+                <w:szCs w:val="22"/>
+                <w:lang w:val="lv-LV" w:eastAsia="lv-LV" w:bidi="ar-SA"/>
+              </w:rPr>
+              <w:t>cnt_days_approved_to_receive</w:t>
             </w:r>
           </w:p>
         </w:tc>
@@ -2154,29 +2167,30 @@
         <w:trPr/>
         <w:tc>
           <w:tcPr>
-            <w:tcW w:w="1602" w:type="dxa"/>
-            <w:tcBorders/>
-          </w:tcPr>
-          <w:p>
-            <w:pPr>
-              <w:pStyle w:val="Normal"/>
-              <w:widowControl/>
-              <w:spacing w:lineRule="auto" w:line="240" w:beforeAutospacing="1" w:after="0"/>
-              <w:jc w:val="left"/>
-              <w:rPr>
-                <w:rFonts w:eastAsia="Times New Roman" w:cs="Calibri" w:cstheme="minorHAnsi"/>
-                <w:lang w:eastAsia="lv-LV"/>
-              </w:rPr>
-            </w:pPr>
-            <w:r>
-              <w:rPr>
-                <w:rFonts w:eastAsia="Times New Roman" w:cs="Calibri" w:cstheme="minorHAnsi"/>
-                <w:kern w:val="0"/>
-                <w:sz w:val="22"/>
-                <w:szCs w:val="22"/>
-                <w:lang w:val="lv-LV" w:eastAsia="lv-LV" w:bidi="ar-SA"/>
-              </w:rPr>
-              <w:t>Rates </w:t>
+            <w:tcW w:w="1601" w:type="dxa"/>
+            <w:tcBorders/>
+          </w:tcPr>
+          <w:p>
+            <w:pPr>
+              <w:pStyle w:val="Normal"/>
+              <w:widowControl/>
+              <w:suppressAutoHyphens w:val="true"/>
+              <w:spacing w:lineRule="auto" w:line="240" w:beforeAutospacing="1" w:after="0"/>
+              <w:jc w:val="left"/>
+              <w:rPr>
+                <w:rFonts w:eastAsia="Times New Roman" w:cs="Calibri" w:cstheme="minorHAnsi"/>
+                <w:lang w:eastAsia="lv-LV"/>
+              </w:rPr>
+            </w:pPr>
+            <w:r>
+              <w:rPr>
+                <w:rFonts w:eastAsia="Times New Roman" w:cs="Calibri" w:cstheme="minorHAnsi"/>
+                <w:kern w:val="0"/>
+                <w:sz w:val="22"/>
+                <w:szCs w:val="22"/>
+                <w:lang w:val="lv-LV" w:eastAsia="lv-LV" w:bidi="ar-SA"/>
+              </w:rPr>
+              <w:t>Rates</w:t>
             </w:r>
           </w:p>
         </w:tc>
@@ -2189,50 +2203,52 @@
             <w:pPr>
               <w:pStyle w:val="Normal"/>
               <w:widowControl/>
-              <w:spacing w:lineRule="auto" w:line="240" w:beforeAutospacing="1" w:after="0"/>
-              <w:jc w:val="left"/>
-              <w:rPr>
-                <w:rFonts w:eastAsia="Times New Roman" w:cs="Calibri" w:cstheme="minorHAnsi"/>
-                <w:lang w:eastAsia="lv-LV"/>
-              </w:rPr>
-            </w:pPr>
-            <w:r>
-              <w:rPr>
-                <w:rFonts w:eastAsia="Times New Roman" w:cs="Calibri" w:cstheme="minorHAnsi"/>
-                <w:kern w:val="0"/>
-                <w:sz w:val="22"/>
-                <w:szCs w:val="22"/>
-                <w:lang w:val="lv-LV" w:eastAsia="lv-LV" w:bidi="ar-SA"/>
-              </w:rPr>
-              <w:t>exchange_rate </w:t>
-            </w:r>
-          </w:p>
-        </w:tc>
-        <w:tc>
-          <w:tcPr>
-            <w:tcW w:w="3086" w:type="dxa"/>
-            <w:tcBorders/>
-          </w:tcPr>
-          <w:p>
-            <w:pPr>
-              <w:pStyle w:val="Normal"/>
-              <w:widowControl/>
-              <w:spacing w:lineRule="auto" w:line="240" w:beforeAutospacing="1" w:after="0"/>
-              <w:jc w:val="left"/>
-              <w:rPr>
-                <w:rFonts w:eastAsia="Times New Roman" w:cs="Calibri" w:cstheme="minorHAnsi"/>
-                <w:lang w:eastAsia="lv-LV"/>
-              </w:rPr>
-            </w:pPr>
-            <w:r>
-              <w:rPr>
-                <w:rFonts w:eastAsia="Times New Roman" w:cs="Calibri" w:cstheme="minorHAnsi"/>
-                <w:kern w:val="0"/>
-                <w:sz w:val="22"/>
-                <w:szCs w:val="22"/>
-                <w:lang w:val="lv-LV" w:eastAsia="lv-LV" w:bidi="ar-SA"/>
-              </w:rPr>
-              <w:t>exchange_rate </w:t>
+              <w:suppressAutoHyphens w:val="true"/>
+              <w:spacing w:lineRule="auto" w:line="240" w:beforeAutospacing="1" w:after="0"/>
+              <w:jc w:val="left"/>
+              <w:rPr>
+                <w:rFonts w:eastAsia="Times New Roman" w:cs="Calibri" w:cstheme="minorHAnsi"/>
+                <w:lang w:eastAsia="lv-LV"/>
+              </w:rPr>
+            </w:pPr>
+            <w:r>
+              <w:rPr>
+                <w:rFonts w:eastAsia="Times New Roman" w:cs="Calibri" w:cstheme="minorHAnsi"/>
+                <w:kern w:val="0"/>
+                <w:sz w:val="22"/>
+                <w:szCs w:val="22"/>
+                <w:lang w:val="lv-LV" w:eastAsia="lv-LV" w:bidi="ar-SA"/>
+              </w:rPr>
+              <w:t>exchange_rate</w:t>
+            </w:r>
+          </w:p>
+        </w:tc>
+        <w:tc>
+          <w:tcPr>
+            <w:tcW w:w="3087" w:type="dxa"/>
+            <w:tcBorders/>
+          </w:tcPr>
+          <w:p>
+            <w:pPr>
+              <w:pStyle w:val="Normal"/>
+              <w:widowControl/>
+              <w:suppressAutoHyphens w:val="true"/>
+              <w:spacing w:lineRule="auto" w:line="240" w:beforeAutospacing="1" w:after="0"/>
+              <w:jc w:val="left"/>
+              <w:rPr>
+                <w:rFonts w:eastAsia="Times New Roman" w:cs="Calibri" w:cstheme="minorHAnsi"/>
+                <w:lang w:eastAsia="lv-LV"/>
+              </w:rPr>
+            </w:pPr>
+            <w:r>
+              <w:rPr>
+                <w:rFonts w:eastAsia="Times New Roman" w:cs="Calibri" w:cstheme="minorHAnsi"/>
+                <w:kern w:val="0"/>
+                <w:sz w:val="22"/>
+                <w:szCs w:val="22"/>
+                <w:lang w:val="lv-LV" w:eastAsia="lv-LV" w:bidi="ar-SA"/>
+              </w:rPr>
+              <w:t>exchange_rate</w:t>
             </w:r>
           </w:p>
         </w:tc>
@@ -2241,29 +2257,30 @@
         <w:trPr/>
         <w:tc>
           <w:tcPr>
-            <w:tcW w:w="1602" w:type="dxa"/>
-            <w:tcBorders/>
-          </w:tcPr>
-          <w:p>
-            <w:pPr>
-              <w:pStyle w:val="Normal"/>
-              <w:widowControl/>
-              <w:spacing w:lineRule="auto" w:line="240" w:beforeAutospacing="1" w:after="0"/>
-              <w:jc w:val="left"/>
-              <w:rPr>
-                <w:rFonts w:eastAsia="Times New Roman" w:cs="Calibri" w:cstheme="minorHAnsi"/>
-                <w:lang w:eastAsia="lv-LV"/>
-              </w:rPr>
-            </w:pPr>
-            <w:r>
-              <w:rPr>
-                <w:rFonts w:eastAsia="Times New Roman" w:cs="Calibri" w:cstheme="minorHAnsi"/>
-                <w:kern w:val="0"/>
-                <w:sz w:val="22"/>
-                <w:szCs w:val="22"/>
-                <w:lang w:val="lv-LV" w:eastAsia="lv-LV" w:bidi="ar-SA"/>
-              </w:rPr>
-              <w:t>Attributes (Codes) </w:t>
+            <w:tcW w:w="1601" w:type="dxa"/>
+            <w:tcBorders/>
+          </w:tcPr>
+          <w:p>
+            <w:pPr>
+              <w:pStyle w:val="Normal"/>
+              <w:widowControl/>
+              <w:suppressAutoHyphens w:val="true"/>
+              <w:spacing w:lineRule="auto" w:line="240" w:beforeAutospacing="1" w:after="0"/>
+              <w:jc w:val="left"/>
+              <w:rPr>
+                <w:rFonts w:eastAsia="Times New Roman" w:cs="Calibri" w:cstheme="minorHAnsi"/>
+                <w:lang w:eastAsia="lv-LV"/>
+              </w:rPr>
+            </w:pPr>
+            <w:r>
+              <w:rPr>
+                <w:rFonts w:eastAsia="Times New Roman" w:cs="Calibri" w:cstheme="minorHAnsi"/>
+                <w:kern w:val="0"/>
+                <w:sz w:val="22"/>
+                <w:szCs w:val="22"/>
+                <w:lang w:val="lv-LV" w:eastAsia="lv-LV" w:bidi="ar-SA"/>
+              </w:rPr>
+              <w:t>Attributes (Codes)</w:t>
             </w:r>
           </w:p>
         </w:tc>
@@ -2276,50 +2293,52 @@
             <w:pPr>
               <w:pStyle w:val="Normal"/>
               <w:widowControl/>
-              <w:spacing w:lineRule="auto" w:line="240" w:beforeAutospacing="1" w:after="0"/>
-              <w:jc w:val="left"/>
-              <w:rPr>
-                <w:rFonts w:eastAsia="Times New Roman" w:cs="Calibri" w:cstheme="minorHAnsi"/>
-                <w:lang w:eastAsia="lv-LV"/>
-              </w:rPr>
-            </w:pPr>
-            <w:r>
-              <w:rPr>
-                <w:rFonts w:eastAsia="Times New Roman" w:cs="Calibri" w:cstheme="minorHAnsi"/>
-                <w:kern w:val="0"/>
-                <w:sz w:val="22"/>
-                <w:szCs w:val="22"/>
-                <w:lang w:val="lv-LV" w:eastAsia="lv-LV" w:bidi="ar-SA"/>
-              </w:rPr>
-              <w:t>&lt;attribute name&gt;_code </w:t>
-            </w:r>
-          </w:p>
-        </w:tc>
-        <w:tc>
-          <w:tcPr>
-            <w:tcW w:w="3086" w:type="dxa"/>
-            <w:tcBorders/>
-          </w:tcPr>
-          <w:p>
-            <w:pPr>
-              <w:pStyle w:val="Normal"/>
-              <w:widowControl/>
-              <w:spacing w:lineRule="auto" w:line="240" w:beforeAutospacing="1" w:after="0"/>
-              <w:jc w:val="left"/>
-              <w:rPr>
-                <w:rFonts w:eastAsia="Times New Roman" w:cs="Calibri" w:cstheme="minorHAnsi"/>
-                <w:lang w:eastAsia="lv-LV"/>
-              </w:rPr>
-            </w:pPr>
-            <w:r>
-              <w:rPr>
-                <w:rFonts w:eastAsia="Times New Roman" w:cs="Calibri" w:cstheme="minorHAnsi"/>
-                <w:kern w:val="0"/>
-                <w:sz w:val="22"/>
-                <w:szCs w:val="22"/>
-                <w:lang w:val="lv-LV" w:eastAsia="lv-LV" w:bidi="ar-SA"/>
-              </w:rPr>
-              <w:t>item_code </w:t>
+              <w:suppressAutoHyphens w:val="true"/>
+              <w:spacing w:lineRule="auto" w:line="240" w:beforeAutospacing="1" w:after="0"/>
+              <w:jc w:val="left"/>
+              <w:rPr>
+                <w:rFonts w:eastAsia="Times New Roman" w:cs="Calibri" w:cstheme="minorHAnsi"/>
+                <w:lang w:eastAsia="lv-LV"/>
+              </w:rPr>
+            </w:pPr>
+            <w:r>
+              <w:rPr>
+                <w:rFonts w:eastAsia="Times New Roman" w:cs="Calibri" w:cstheme="minorHAnsi"/>
+                <w:kern w:val="0"/>
+                <w:sz w:val="22"/>
+                <w:szCs w:val="22"/>
+                <w:lang w:val="lv-LV" w:eastAsia="lv-LV" w:bidi="ar-SA"/>
+              </w:rPr>
+              <w:t>&lt;attribute name&gt;_code</w:t>
+            </w:r>
+          </w:p>
+        </w:tc>
+        <w:tc>
+          <w:tcPr>
+            <w:tcW w:w="3087" w:type="dxa"/>
+            <w:tcBorders/>
+          </w:tcPr>
+          <w:p>
+            <w:pPr>
+              <w:pStyle w:val="Normal"/>
+              <w:widowControl/>
+              <w:suppressAutoHyphens w:val="true"/>
+              <w:spacing w:lineRule="auto" w:line="240" w:beforeAutospacing="1" w:after="0"/>
+              <w:jc w:val="left"/>
+              <w:rPr>
+                <w:rFonts w:eastAsia="Times New Roman" w:cs="Calibri" w:cstheme="minorHAnsi"/>
+                <w:lang w:eastAsia="lv-LV"/>
+              </w:rPr>
+            </w:pPr>
+            <w:r>
+              <w:rPr>
+                <w:rFonts w:eastAsia="Times New Roman" w:cs="Calibri" w:cstheme="minorHAnsi"/>
+                <w:kern w:val="0"/>
+                <w:sz w:val="22"/>
+                <w:szCs w:val="22"/>
+                <w:lang w:val="lv-LV" w:eastAsia="lv-LV" w:bidi="ar-SA"/>
+              </w:rPr>
+              <w:t>item_code</w:t>
             </w:r>
           </w:p>
         </w:tc>
@@ -2328,29 +2347,30 @@
         <w:trPr/>
         <w:tc>
           <w:tcPr>
-            <w:tcW w:w="1602" w:type="dxa"/>
-            <w:tcBorders/>
-          </w:tcPr>
-          <w:p>
-            <w:pPr>
-              <w:pStyle w:val="Normal"/>
-              <w:widowControl/>
-              <w:spacing w:lineRule="auto" w:line="240" w:beforeAutospacing="1" w:after="0"/>
-              <w:jc w:val="left"/>
-              <w:rPr>
-                <w:rFonts w:eastAsia="Times New Roman" w:cs="Calibri" w:cstheme="minorHAnsi"/>
-                <w:lang w:eastAsia="lv-LV"/>
-              </w:rPr>
-            </w:pPr>
-            <w:r>
-              <w:rPr>
-                <w:rFonts w:eastAsia="Times New Roman" w:cs="Calibri" w:cstheme="minorHAnsi"/>
-                <w:kern w:val="0"/>
-                <w:sz w:val="22"/>
-                <w:szCs w:val="22"/>
-                <w:lang w:val="lv-LV" w:eastAsia="lv-LV" w:bidi="ar-SA"/>
-              </w:rPr>
-              <w:t>Attributes (Names) </w:t>
+            <w:tcW w:w="1601" w:type="dxa"/>
+            <w:tcBorders/>
+          </w:tcPr>
+          <w:p>
+            <w:pPr>
+              <w:pStyle w:val="Normal"/>
+              <w:widowControl/>
+              <w:suppressAutoHyphens w:val="true"/>
+              <w:spacing w:lineRule="auto" w:line="240" w:beforeAutospacing="1" w:after="0"/>
+              <w:jc w:val="left"/>
+              <w:rPr>
+                <w:rFonts w:eastAsia="Times New Roman" w:cs="Calibri" w:cstheme="minorHAnsi"/>
+                <w:lang w:eastAsia="lv-LV"/>
+              </w:rPr>
+            </w:pPr>
+            <w:r>
+              <w:rPr>
+                <w:rFonts w:eastAsia="Times New Roman" w:cs="Calibri" w:cstheme="minorHAnsi"/>
+                <w:kern w:val="0"/>
+                <w:sz w:val="22"/>
+                <w:szCs w:val="22"/>
+                <w:lang w:val="lv-LV" w:eastAsia="lv-LV" w:bidi="ar-SA"/>
+              </w:rPr>
+              <w:t>Attributes (Names)</w:t>
             </w:r>
           </w:p>
         </w:tc>
@@ -2363,50 +2383,52 @@
             <w:pPr>
               <w:pStyle w:val="Normal"/>
               <w:widowControl/>
-              <w:spacing w:lineRule="auto" w:line="240" w:beforeAutospacing="1" w:after="0"/>
-              <w:jc w:val="left"/>
-              <w:rPr>
-                <w:rFonts w:eastAsia="Times New Roman" w:cs="Calibri" w:cstheme="minorHAnsi"/>
-                <w:lang w:eastAsia="lv-LV"/>
-              </w:rPr>
-            </w:pPr>
-            <w:r>
-              <w:rPr>
-                <w:rFonts w:eastAsia="Times New Roman" w:cs="Calibri" w:cstheme="minorHAnsi"/>
-                <w:kern w:val="0"/>
-                <w:sz w:val="22"/>
-                <w:szCs w:val="22"/>
-                <w:lang w:val="lv-LV" w:eastAsia="lv-LV" w:bidi="ar-SA"/>
-              </w:rPr>
-              <w:t>&lt;attribute name&gt;_name </w:t>
-            </w:r>
-          </w:p>
-        </w:tc>
-        <w:tc>
-          <w:tcPr>
-            <w:tcW w:w="3086" w:type="dxa"/>
-            <w:tcBorders/>
-          </w:tcPr>
-          <w:p>
-            <w:pPr>
-              <w:pStyle w:val="Normal"/>
-              <w:widowControl/>
-              <w:spacing w:lineRule="auto" w:line="240" w:beforeAutospacing="1" w:after="0"/>
-              <w:jc w:val="left"/>
-              <w:rPr>
-                <w:rFonts w:eastAsia="Times New Roman" w:cs="Calibri" w:cstheme="minorHAnsi"/>
-                <w:lang w:eastAsia="lv-LV"/>
-              </w:rPr>
-            </w:pPr>
-            <w:r>
-              <w:rPr>
-                <w:rFonts w:eastAsia="Times New Roman" w:cs="Calibri" w:cstheme="minorHAnsi"/>
-                <w:kern w:val="0"/>
-                <w:sz w:val="22"/>
-                <w:szCs w:val="22"/>
-                <w:lang w:val="lv-LV" w:eastAsia="lv-LV" w:bidi="ar-SA"/>
-              </w:rPr>
-              <w:t>item_name </w:t>
+              <w:suppressAutoHyphens w:val="true"/>
+              <w:spacing w:lineRule="auto" w:line="240" w:beforeAutospacing="1" w:after="0"/>
+              <w:jc w:val="left"/>
+              <w:rPr>
+                <w:rFonts w:eastAsia="Times New Roman" w:cs="Calibri" w:cstheme="minorHAnsi"/>
+                <w:lang w:eastAsia="lv-LV"/>
+              </w:rPr>
+            </w:pPr>
+            <w:r>
+              <w:rPr>
+                <w:rFonts w:eastAsia="Times New Roman" w:cs="Calibri" w:cstheme="minorHAnsi"/>
+                <w:kern w:val="0"/>
+                <w:sz w:val="22"/>
+                <w:szCs w:val="22"/>
+                <w:lang w:val="lv-LV" w:eastAsia="lv-LV" w:bidi="ar-SA"/>
+              </w:rPr>
+              <w:t>&lt;attribute name&gt;_name</w:t>
+            </w:r>
+          </w:p>
+        </w:tc>
+        <w:tc>
+          <w:tcPr>
+            <w:tcW w:w="3087" w:type="dxa"/>
+            <w:tcBorders/>
+          </w:tcPr>
+          <w:p>
+            <w:pPr>
+              <w:pStyle w:val="Normal"/>
+              <w:widowControl/>
+              <w:suppressAutoHyphens w:val="true"/>
+              <w:spacing w:lineRule="auto" w:line="240" w:beforeAutospacing="1" w:after="0"/>
+              <w:jc w:val="left"/>
+              <w:rPr>
+                <w:rFonts w:eastAsia="Times New Roman" w:cs="Calibri" w:cstheme="minorHAnsi"/>
+                <w:lang w:eastAsia="lv-LV"/>
+              </w:rPr>
+            </w:pPr>
+            <w:r>
+              <w:rPr>
+                <w:rFonts w:eastAsia="Times New Roman" w:cs="Calibri" w:cstheme="minorHAnsi"/>
+                <w:kern w:val="0"/>
+                <w:sz w:val="22"/>
+                <w:szCs w:val="22"/>
+                <w:lang w:val="lv-LV" w:eastAsia="lv-LV" w:bidi="ar-SA"/>
+              </w:rPr>
+              <w:t>item_name</w:t>
             </w:r>
           </w:p>
         </w:tc>
@@ -2415,29 +2437,30 @@
         <w:trPr/>
         <w:tc>
           <w:tcPr>
-            <w:tcW w:w="1602" w:type="dxa"/>
-            <w:tcBorders/>
-          </w:tcPr>
-          <w:p>
-            <w:pPr>
-              <w:pStyle w:val="Normal"/>
-              <w:widowControl/>
-              <w:spacing w:lineRule="auto" w:line="240" w:beforeAutospacing="1" w:after="0"/>
-              <w:jc w:val="left"/>
-              <w:rPr>
-                <w:rFonts w:eastAsia="Times New Roman" w:cs="Calibri" w:cstheme="minorHAnsi"/>
-                <w:lang w:eastAsia="lv-LV"/>
-              </w:rPr>
-            </w:pPr>
-            <w:r>
-              <w:rPr>
-                <w:rFonts w:eastAsia="Times New Roman" w:cs="Calibri" w:cstheme="minorHAnsi"/>
-                <w:kern w:val="0"/>
-                <w:sz w:val="22"/>
-                <w:szCs w:val="22"/>
-                <w:lang w:val="lv-LV" w:eastAsia="lv-LV" w:bidi="ar-SA"/>
-              </w:rPr>
-              <w:t>Combined attributes </w:t>
+            <w:tcW w:w="1601" w:type="dxa"/>
+            <w:tcBorders/>
+          </w:tcPr>
+          <w:p>
+            <w:pPr>
+              <w:pStyle w:val="Normal"/>
+              <w:widowControl/>
+              <w:suppressAutoHyphens w:val="true"/>
+              <w:spacing w:lineRule="auto" w:line="240" w:beforeAutospacing="1" w:after="0"/>
+              <w:jc w:val="left"/>
+              <w:rPr>
+                <w:rFonts w:eastAsia="Times New Roman" w:cs="Calibri" w:cstheme="minorHAnsi"/>
+                <w:lang w:eastAsia="lv-LV"/>
+              </w:rPr>
+            </w:pPr>
+            <w:r>
+              <w:rPr>
+                <w:rFonts w:eastAsia="Times New Roman" w:cs="Calibri" w:cstheme="minorHAnsi"/>
+                <w:kern w:val="0"/>
+                <w:sz w:val="22"/>
+                <w:szCs w:val="22"/>
+                <w:lang w:val="lv-LV" w:eastAsia="lv-LV" w:bidi="ar-SA"/>
+              </w:rPr>
+              <w:t>Combined attributes</w:t>
             </w:r>
           </w:p>
         </w:tc>
@@ -2450,50 +2473,52 @@
             <w:pPr>
               <w:pStyle w:val="Normal"/>
               <w:widowControl/>
-              <w:spacing w:lineRule="auto" w:line="240" w:beforeAutospacing="1" w:after="0"/>
-              <w:jc w:val="left"/>
-              <w:rPr>
-                <w:rFonts w:eastAsia="Times New Roman" w:cs="Calibri" w:cstheme="minorHAnsi"/>
-                <w:lang w:eastAsia="lv-LV"/>
-              </w:rPr>
-            </w:pPr>
-            <w:r>
-              <w:rPr>
-                <w:rFonts w:eastAsia="Times New Roman" w:cs="Calibri" w:cstheme="minorHAnsi"/>
-                <w:kern w:val="0"/>
-                <w:sz w:val="22"/>
-                <w:szCs w:val="22"/>
-                <w:lang w:val="lv-LV" w:eastAsia="lv-LV" w:bidi="ar-SA"/>
-              </w:rPr>
-              <w:t>&lt;attribute name&gt;_and_&lt;attribute_name&gt; </w:t>
-            </w:r>
-          </w:p>
-        </w:tc>
-        <w:tc>
-          <w:tcPr>
-            <w:tcW w:w="3086" w:type="dxa"/>
-            <w:tcBorders/>
-          </w:tcPr>
-          <w:p>
-            <w:pPr>
-              <w:pStyle w:val="Normal"/>
-              <w:widowControl/>
-              <w:spacing w:lineRule="auto" w:line="240" w:beforeAutospacing="1" w:after="0"/>
-              <w:jc w:val="left"/>
-              <w:rPr>
-                <w:rFonts w:eastAsia="Times New Roman" w:cs="Calibri" w:cstheme="minorHAnsi"/>
-                <w:lang w:eastAsia="lv-LV"/>
-              </w:rPr>
-            </w:pPr>
-            <w:r>
-              <w:rPr>
-                <w:rFonts w:eastAsia="Times New Roman" w:cs="Calibri" w:cstheme="minorHAnsi"/>
-                <w:kern w:val="0"/>
-                <w:sz w:val="22"/>
-                <w:szCs w:val="22"/>
-                <w:lang w:val="lv-LV" w:eastAsia="lv-LV" w:bidi="ar-SA"/>
-              </w:rPr>
-              <w:t>item_code_and_name </w:t>
+              <w:suppressAutoHyphens w:val="true"/>
+              <w:spacing w:lineRule="auto" w:line="240" w:beforeAutospacing="1" w:after="0"/>
+              <w:jc w:val="left"/>
+              <w:rPr>
+                <w:rFonts w:eastAsia="Times New Roman" w:cs="Calibri" w:cstheme="minorHAnsi"/>
+                <w:lang w:eastAsia="lv-LV"/>
+              </w:rPr>
+            </w:pPr>
+            <w:r>
+              <w:rPr>
+                <w:rFonts w:eastAsia="Times New Roman" w:cs="Calibri" w:cstheme="minorHAnsi"/>
+                <w:kern w:val="0"/>
+                <w:sz w:val="22"/>
+                <w:szCs w:val="22"/>
+                <w:lang w:val="lv-LV" w:eastAsia="lv-LV" w:bidi="ar-SA"/>
+              </w:rPr>
+              <w:t>&lt;attribute name&gt;_and_&lt;attribute_name&gt;</w:t>
+            </w:r>
+          </w:p>
+        </w:tc>
+        <w:tc>
+          <w:tcPr>
+            <w:tcW w:w="3087" w:type="dxa"/>
+            <w:tcBorders/>
+          </w:tcPr>
+          <w:p>
+            <w:pPr>
+              <w:pStyle w:val="Normal"/>
+              <w:widowControl/>
+              <w:suppressAutoHyphens w:val="true"/>
+              <w:spacing w:lineRule="auto" w:line="240" w:beforeAutospacing="1" w:after="0"/>
+              <w:jc w:val="left"/>
+              <w:rPr>
+                <w:rFonts w:eastAsia="Times New Roman" w:cs="Calibri" w:cstheme="minorHAnsi"/>
+                <w:lang w:eastAsia="lv-LV"/>
+              </w:rPr>
+            </w:pPr>
+            <w:r>
+              <w:rPr>
+                <w:rFonts w:eastAsia="Times New Roman" w:cs="Calibri" w:cstheme="minorHAnsi"/>
+                <w:kern w:val="0"/>
+                <w:sz w:val="22"/>
+                <w:szCs w:val="22"/>
+                <w:lang w:val="lv-LV" w:eastAsia="lv-LV" w:bidi="ar-SA"/>
+              </w:rPr>
+              <w:t>item_code_and_name</w:t>
             </w:r>
           </w:p>
         </w:tc>
@@ -2502,29 +2527,30 @@
         <w:trPr/>
         <w:tc>
           <w:tcPr>
-            <w:tcW w:w="1602" w:type="dxa"/>
-            <w:tcBorders/>
-          </w:tcPr>
-          <w:p>
-            <w:pPr>
-              <w:pStyle w:val="Normal"/>
-              <w:widowControl/>
-              <w:spacing w:lineRule="auto" w:line="240" w:beforeAutospacing="1" w:after="0"/>
-              <w:jc w:val="left"/>
-              <w:rPr>
-                <w:rFonts w:eastAsia="Times New Roman" w:cs="Calibri" w:cstheme="minorHAnsi"/>
-                <w:lang w:eastAsia="lv-LV"/>
-              </w:rPr>
-            </w:pPr>
-            <w:r>
-              <w:rPr>
-                <w:rFonts w:eastAsia="Times New Roman" w:cs="Calibri" w:cstheme="minorHAnsi"/>
-                <w:kern w:val="0"/>
-                <w:sz w:val="22"/>
-                <w:szCs w:val="22"/>
-                <w:lang w:val="lv-LV" w:eastAsia="lv-LV" w:bidi="ar-SA"/>
-              </w:rPr>
-              <w:t>Attributes (Descriptions) </w:t>
+            <w:tcW w:w="1601" w:type="dxa"/>
+            <w:tcBorders/>
+          </w:tcPr>
+          <w:p>
+            <w:pPr>
+              <w:pStyle w:val="Normal"/>
+              <w:widowControl/>
+              <w:suppressAutoHyphens w:val="true"/>
+              <w:spacing w:lineRule="auto" w:line="240" w:beforeAutospacing="1" w:after="0"/>
+              <w:jc w:val="left"/>
+              <w:rPr>
+                <w:rFonts w:eastAsia="Times New Roman" w:cs="Calibri" w:cstheme="minorHAnsi"/>
+                <w:lang w:eastAsia="lv-LV"/>
+              </w:rPr>
+            </w:pPr>
+            <w:r>
+              <w:rPr>
+                <w:rFonts w:eastAsia="Times New Roman" w:cs="Calibri" w:cstheme="minorHAnsi"/>
+                <w:kern w:val="0"/>
+                <w:sz w:val="22"/>
+                <w:szCs w:val="22"/>
+                <w:lang w:val="lv-LV" w:eastAsia="lv-LV" w:bidi="ar-SA"/>
+              </w:rPr>
+              <w:t>Attributes (Descriptions)</w:t>
             </w:r>
           </w:p>
         </w:tc>
@@ -2537,50 +2563,52 @@
             <w:pPr>
               <w:pStyle w:val="Normal"/>
               <w:widowControl/>
-              <w:spacing w:lineRule="auto" w:line="240" w:beforeAutospacing="1" w:after="0"/>
-              <w:jc w:val="left"/>
-              <w:rPr>
-                <w:rFonts w:eastAsia="Times New Roman" w:cs="Calibri" w:cstheme="minorHAnsi"/>
-                <w:lang w:eastAsia="lv-LV"/>
-              </w:rPr>
-            </w:pPr>
-            <w:r>
-              <w:rPr>
-                <w:rFonts w:eastAsia="Times New Roman" w:cs="Calibri" w:cstheme="minorHAnsi"/>
-                <w:kern w:val="0"/>
-                <w:sz w:val="22"/>
-                <w:szCs w:val="22"/>
-                <w:lang w:val="lv-LV" w:eastAsia="lv-LV" w:bidi="ar-SA"/>
-              </w:rPr>
-              <w:t>&lt;attribute_name&gt;_descr </w:t>
-            </w:r>
-          </w:p>
-        </w:tc>
-        <w:tc>
-          <w:tcPr>
-            <w:tcW w:w="3086" w:type="dxa"/>
-            <w:tcBorders/>
-          </w:tcPr>
-          <w:p>
-            <w:pPr>
-              <w:pStyle w:val="Normal"/>
-              <w:widowControl/>
-              <w:spacing w:lineRule="auto" w:line="240" w:beforeAutospacing="1" w:after="0"/>
-              <w:jc w:val="left"/>
-              <w:rPr>
-                <w:rFonts w:eastAsia="Times New Roman" w:cs="Calibri" w:cstheme="minorHAnsi"/>
-                <w:lang w:eastAsia="lv-LV"/>
-              </w:rPr>
-            </w:pPr>
-            <w:r>
-              <w:rPr>
-                <w:rFonts w:eastAsia="Times New Roman" w:cs="Calibri" w:cstheme="minorHAnsi"/>
-                <w:kern w:val="0"/>
-                <w:sz w:val="22"/>
-                <w:szCs w:val="22"/>
-                <w:lang w:val="lv-LV" w:eastAsia="lv-LV" w:bidi="ar-SA"/>
-              </w:rPr>
-              <w:t>item_descr </w:t>
+              <w:suppressAutoHyphens w:val="true"/>
+              <w:spacing w:lineRule="auto" w:line="240" w:beforeAutospacing="1" w:after="0"/>
+              <w:jc w:val="left"/>
+              <w:rPr>
+                <w:rFonts w:eastAsia="Times New Roman" w:cs="Calibri" w:cstheme="minorHAnsi"/>
+                <w:lang w:eastAsia="lv-LV"/>
+              </w:rPr>
+            </w:pPr>
+            <w:r>
+              <w:rPr>
+                <w:rFonts w:eastAsia="Times New Roman" w:cs="Calibri" w:cstheme="minorHAnsi"/>
+                <w:kern w:val="0"/>
+                <w:sz w:val="22"/>
+                <w:szCs w:val="22"/>
+                <w:lang w:val="lv-LV" w:eastAsia="lv-LV" w:bidi="ar-SA"/>
+              </w:rPr>
+              <w:t>&lt;attribute_name&gt;_descr</w:t>
+            </w:r>
+          </w:p>
+        </w:tc>
+        <w:tc>
+          <w:tcPr>
+            <w:tcW w:w="3087" w:type="dxa"/>
+            <w:tcBorders/>
+          </w:tcPr>
+          <w:p>
+            <w:pPr>
+              <w:pStyle w:val="Normal"/>
+              <w:widowControl/>
+              <w:suppressAutoHyphens w:val="true"/>
+              <w:spacing w:lineRule="auto" w:line="240" w:beforeAutospacing="1" w:after="0"/>
+              <w:jc w:val="left"/>
+              <w:rPr>
+                <w:rFonts w:eastAsia="Times New Roman" w:cs="Calibri" w:cstheme="minorHAnsi"/>
+                <w:lang w:eastAsia="lv-LV"/>
+              </w:rPr>
+            </w:pPr>
+            <w:r>
+              <w:rPr>
+                <w:rFonts w:eastAsia="Times New Roman" w:cs="Calibri" w:cstheme="minorHAnsi"/>
+                <w:kern w:val="0"/>
+                <w:sz w:val="22"/>
+                <w:szCs w:val="22"/>
+                <w:lang w:val="lv-LV" w:eastAsia="lv-LV" w:bidi="ar-SA"/>
+              </w:rPr>
+              <w:t>item_descr</w:t>
             </w:r>
           </w:p>
         </w:tc>
@@ -2589,29 +2617,30 @@
         <w:trPr/>
         <w:tc>
           <w:tcPr>
-            <w:tcW w:w="1602" w:type="dxa"/>
-            <w:tcBorders/>
-          </w:tcPr>
-          <w:p>
-            <w:pPr>
-              <w:pStyle w:val="Normal"/>
-              <w:widowControl/>
-              <w:spacing w:lineRule="auto" w:line="240" w:beforeAutospacing="1" w:after="0"/>
-              <w:jc w:val="left"/>
-              <w:rPr>
-                <w:rFonts w:eastAsia="Times New Roman" w:cs="Calibri" w:cstheme="minorHAnsi"/>
-                <w:lang w:eastAsia="lv-LV"/>
-              </w:rPr>
-            </w:pPr>
-            <w:r>
-              <w:rPr>
-                <w:rFonts w:eastAsia="Times New Roman" w:cs="Calibri" w:cstheme="minorHAnsi"/>
-                <w:kern w:val="0"/>
-                <w:sz w:val="22"/>
-                <w:szCs w:val="22"/>
-                <w:lang w:val="lv-LV" w:eastAsia="lv-LV" w:bidi="ar-SA"/>
-              </w:rPr>
-              <w:t>Attributes (Flags) </w:t>
+            <w:tcW w:w="1601" w:type="dxa"/>
+            <w:tcBorders/>
+          </w:tcPr>
+          <w:p>
+            <w:pPr>
+              <w:pStyle w:val="Normal"/>
+              <w:widowControl/>
+              <w:suppressAutoHyphens w:val="true"/>
+              <w:spacing w:lineRule="auto" w:line="240" w:beforeAutospacing="1" w:after="0"/>
+              <w:jc w:val="left"/>
+              <w:rPr>
+                <w:rFonts w:eastAsia="Times New Roman" w:cs="Calibri" w:cstheme="minorHAnsi"/>
+                <w:lang w:eastAsia="lv-LV"/>
+              </w:rPr>
+            </w:pPr>
+            <w:r>
+              <w:rPr>
+                <w:rFonts w:eastAsia="Times New Roman" w:cs="Calibri" w:cstheme="minorHAnsi"/>
+                <w:kern w:val="0"/>
+                <w:sz w:val="22"/>
+                <w:szCs w:val="22"/>
+                <w:lang w:val="lv-LV" w:eastAsia="lv-LV" w:bidi="ar-SA"/>
+              </w:rPr>
+              <w:t>Attributes (Flags)</w:t>
             </w:r>
           </w:p>
         </w:tc>
@@ -2624,50 +2653,52 @@
             <w:pPr>
               <w:pStyle w:val="Normal"/>
               <w:widowControl/>
-              <w:spacing w:lineRule="auto" w:line="240" w:beforeAutospacing="1" w:after="0"/>
-              <w:jc w:val="left"/>
-              <w:rPr>
-                <w:rFonts w:eastAsia="Times New Roman" w:cs="Calibri" w:cstheme="minorHAnsi"/>
-                <w:lang w:eastAsia="lv-LV"/>
-              </w:rPr>
-            </w:pPr>
-            <w:r>
-              <w:rPr>
-                <w:rFonts w:eastAsia="Times New Roman" w:cs="Calibri" w:cstheme="minorHAnsi"/>
-                <w:kern w:val="0"/>
-                <w:sz w:val="22"/>
-                <w:szCs w:val="22"/>
-                <w:lang w:val="lv-LV" w:eastAsia="lv-LV" w:bidi="ar-SA"/>
-              </w:rPr>
-              <w:t>is_&lt;attribute&gt; </w:t>
-            </w:r>
-          </w:p>
-        </w:tc>
-        <w:tc>
-          <w:tcPr>
-            <w:tcW w:w="3086" w:type="dxa"/>
-            <w:tcBorders/>
-          </w:tcPr>
-          <w:p>
-            <w:pPr>
-              <w:pStyle w:val="Normal"/>
-              <w:widowControl/>
-              <w:spacing w:lineRule="auto" w:line="240" w:beforeAutospacing="1" w:after="0"/>
-              <w:jc w:val="left"/>
-              <w:rPr>
-                <w:rFonts w:eastAsia="Times New Roman" w:cs="Calibri" w:cstheme="minorHAnsi"/>
-                <w:lang w:eastAsia="lv-LV"/>
-              </w:rPr>
-            </w:pPr>
-            <w:r>
-              <w:rPr>
-                <w:rFonts w:eastAsia="Times New Roman" w:cs="Calibri" w:cstheme="minorHAnsi"/>
-                <w:kern w:val="0"/>
-                <w:sz w:val="22"/>
-                <w:szCs w:val="22"/>
-                <w:lang w:val="lv-LV" w:eastAsia="lv-LV" w:bidi="ar-SA"/>
-              </w:rPr>
-              <w:t>is_delivered </w:t>
+              <w:suppressAutoHyphens w:val="true"/>
+              <w:spacing w:lineRule="auto" w:line="240" w:beforeAutospacing="1" w:after="0"/>
+              <w:jc w:val="left"/>
+              <w:rPr>
+                <w:rFonts w:eastAsia="Times New Roman" w:cs="Calibri" w:cstheme="minorHAnsi"/>
+                <w:lang w:eastAsia="lv-LV"/>
+              </w:rPr>
+            </w:pPr>
+            <w:r>
+              <w:rPr>
+                <w:rFonts w:eastAsia="Times New Roman" w:cs="Calibri" w:cstheme="minorHAnsi"/>
+                <w:kern w:val="0"/>
+                <w:sz w:val="22"/>
+                <w:szCs w:val="22"/>
+                <w:lang w:val="lv-LV" w:eastAsia="lv-LV" w:bidi="ar-SA"/>
+              </w:rPr>
+              <w:t>is_&lt;attribute&gt;</w:t>
+            </w:r>
+          </w:p>
+        </w:tc>
+        <w:tc>
+          <w:tcPr>
+            <w:tcW w:w="3087" w:type="dxa"/>
+            <w:tcBorders/>
+          </w:tcPr>
+          <w:p>
+            <w:pPr>
+              <w:pStyle w:val="Normal"/>
+              <w:widowControl/>
+              <w:suppressAutoHyphens w:val="true"/>
+              <w:spacing w:lineRule="auto" w:line="240" w:beforeAutospacing="1" w:after="0"/>
+              <w:jc w:val="left"/>
+              <w:rPr>
+                <w:rFonts w:eastAsia="Times New Roman" w:cs="Calibri" w:cstheme="minorHAnsi"/>
+                <w:lang w:eastAsia="lv-LV"/>
+              </w:rPr>
+            </w:pPr>
+            <w:r>
+              <w:rPr>
+                <w:rFonts w:eastAsia="Times New Roman" w:cs="Calibri" w:cstheme="minorHAnsi"/>
+                <w:kern w:val="0"/>
+                <w:sz w:val="22"/>
+                <w:szCs w:val="22"/>
+                <w:lang w:val="lv-LV" w:eastAsia="lv-LV" w:bidi="ar-SA"/>
+              </w:rPr>
+              <w:t>is_delivered</w:t>
             </w:r>
           </w:p>
         </w:tc>
@@ -2676,13 +2707,14 @@
         <w:trPr/>
         <w:tc>
           <w:tcPr>
-            <w:tcW w:w="1602" w:type="dxa"/>
-            <w:tcBorders/>
-          </w:tcPr>
-          <w:p>
-            <w:pPr>
-              <w:pStyle w:val="Normal"/>
-              <w:widowControl/>
+            <w:tcW w:w="1601" w:type="dxa"/>
+            <w:tcBorders/>
+          </w:tcPr>
+          <w:p>
+            <w:pPr>
+              <w:pStyle w:val="Normal"/>
+              <w:widowControl/>
+              <w:suppressAutoHyphens w:val="true"/>
               <w:spacing w:lineRule="auto" w:line="240" w:before="0" w:after="0"/>
               <w:jc w:val="left"/>
               <w:rPr>
@@ -2698,7 +2730,7 @@
                 <w:szCs w:val="22"/>
                 <w:lang w:val="lv-LV" w:eastAsia="lv-LV" w:bidi="ar-SA"/>
               </w:rPr>
-              <w:t>Attributes (Descriptive information, labels) </w:t>
+              <w:t>Attributes (Descriptive information, labels)</w:t>
             </w:r>
           </w:p>
         </w:tc>
@@ -2711,6 +2743,7 @@
             <w:pPr>
               <w:pStyle w:val="Normal"/>
               <w:widowControl/>
+              <w:suppressAutoHyphens w:val="true"/>
               <w:spacing w:lineRule="auto" w:line="240" w:before="0" w:after="0"/>
               <w:jc w:val="left"/>
               <w:rPr>
@@ -2732,13 +2765,14 @@
         </w:tc>
         <w:tc>
           <w:tcPr>
-            <w:tcW w:w="3086" w:type="dxa"/>
-            <w:tcBorders/>
-          </w:tcPr>
-          <w:p>
-            <w:pPr>
-              <w:pStyle w:val="Normal"/>
-              <w:widowControl/>
+            <w:tcW w:w="3087" w:type="dxa"/>
+            <w:tcBorders/>
+          </w:tcPr>
+          <w:p>
+            <w:pPr>
+              <w:pStyle w:val="Normal"/>
+              <w:widowControl/>
+              <w:suppressAutoHyphens w:val="true"/>
               <w:spacing w:lineRule="auto" w:line="240" w:before="0" w:after="0"/>
               <w:jc w:val="left"/>
               <w:rPr>
@@ -2822,21 +2856,22 @@
         <w:tblLook w:firstRow="1" w:noVBand="1" w:lastRow="0" w:firstColumn="1" w:lastColumn="0" w:noHBand="0" w:val="04a0"/>
       </w:tblPr>
       <w:tblGrid>
-        <w:gridCol w:w="1715"/>
-        <w:gridCol w:w="2223"/>
+        <w:gridCol w:w="1714"/>
+        <w:gridCol w:w="2224"/>
         <w:gridCol w:w="4358"/>
       </w:tblGrid>
       <w:tr>
         <w:trPr/>
         <w:tc>
           <w:tcPr>
-            <w:tcW w:w="1715" w:type="dxa"/>
-            <w:tcBorders/>
-          </w:tcPr>
-          <w:p>
-            <w:pPr>
-              <w:pStyle w:val="Normal"/>
-              <w:widowControl/>
+            <w:tcW w:w="1714" w:type="dxa"/>
+            <w:tcBorders/>
+          </w:tcPr>
+          <w:p>
+            <w:pPr>
+              <w:pStyle w:val="Normal"/>
+              <w:widowControl/>
+              <w:suppressAutoHyphens w:val="true"/>
               <w:spacing w:lineRule="auto" w:line="240" w:beforeAutospacing="1" w:after="0"/>
               <w:jc w:val="left"/>
               <w:rPr>
@@ -2856,27 +2891,18 @@
               </w:rPr>
               <w:t>Object</w:t>
             </w:r>
-            <w:r>
-              <w:rPr>
-                <w:rFonts w:eastAsia="Times New Roman" w:cs="Calibri" w:cstheme="minorHAnsi"/>
-                <w:kern w:val="0"/>
-                <w:sz w:val="22"/>
-                <w:szCs w:val="22"/>
-                <w:lang w:val="lv-LV" w:eastAsia="lv-LV" w:bidi="ar-SA"/>
-              </w:rPr>
-              <w:t> </w:t>
-            </w:r>
-          </w:p>
-        </w:tc>
-        <w:tc>
-          <w:tcPr>
-            <w:tcW w:w="2223" w:type="dxa"/>
-            <w:tcBorders/>
-          </w:tcPr>
-          <w:p>
-            <w:pPr>
-              <w:pStyle w:val="Normal"/>
-              <w:widowControl/>
+          </w:p>
+        </w:tc>
+        <w:tc>
+          <w:tcPr>
+            <w:tcW w:w="2224" w:type="dxa"/>
+            <w:tcBorders/>
+          </w:tcPr>
+          <w:p>
+            <w:pPr>
+              <w:pStyle w:val="Normal"/>
+              <w:widowControl/>
+              <w:suppressAutoHyphens w:val="true"/>
               <w:spacing w:lineRule="auto" w:line="240" w:beforeAutospacing="1" w:after="0"/>
               <w:jc w:val="left"/>
               <w:rPr>
@@ -2896,16 +2922,6 @@
               </w:rPr>
               <w:t>Example</w:t>
             </w:r>
-            <w:r>
-              <w:rPr>
-                <w:rFonts w:eastAsia="Times New Roman" w:cs="Calibri" w:cstheme="minorHAnsi"/>
-                <w:kern w:val="0"/>
-                <w:sz w:val="22"/>
-                <w:szCs w:val="22"/>
-                <w:lang w:val="lv-LV" w:eastAsia="lv-LV" w:bidi="ar-SA"/>
-              </w:rPr>
-              <w:t> </w:t>
-            </w:r>
           </w:p>
         </w:tc>
         <w:tc>
@@ -2917,6 +2933,7 @@
             <w:pPr>
               <w:pStyle w:val="Normal"/>
               <w:widowControl/>
+              <w:suppressAutoHyphens w:val="true"/>
               <w:spacing w:lineRule="auto" w:line="240" w:beforeAutospacing="1" w:after="0"/>
               <w:jc w:val="left"/>
               <w:rPr>
@@ -2935,16 +2952,6 @@
                 <w:lang w:val="en-US" w:eastAsia="lv-LV" w:bidi="ar-SA"/>
               </w:rPr>
               <w:t>Description</w:t>
-            </w:r>
-            <w:r>
-              <w:rPr>
-                <w:rFonts w:eastAsia="Times New Roman" w:cs="Calibri" w:cstheme="minorHAnsi"/>
-                <w:kern w:val="0"/>
-                <w:sz w:val="22"/>
-                <w:szCs w:val="22"/>
-                <w:lang w:val="lv-LV" w:eastAsia="lv-LV" w:bidi="ar-SA"/>
-              </w:rPr>
-              <w:t> </w:t>
             </w:r>
           </w:p>
         </w:tc>
@@ -2953,13 +2960,14 @@
         <w:trPr/>
         <w:tc>
           <w:tcPr>
-            <w:tcW w:w="1715" w:type="dxa"/>
-            <w:tcBorders/>
-          </w:tcPr>
-          <w:p>
-            <w:pPr>
-              <w:pStyle w:val="Normal"/>
-              <w:widowControl/>
+            <w:tcW w:w="1714" w:type="dxa"/>
+            <w:tcBorders/>
+          </w:tcPr>
+          <w:p>
+            <w:pPr>
+              <w:pStyle w:val="Normal"/>
+              <w:widowControl/>
+              <w:suppressAutoHyphens w:val="true"/>
               <w:spacing w:lineRule="auto" w:line="240" w:beforeAutospacing="1" w:after="0"/>
               <w:jc w:val="left"/>
               <w:rPr>
@@ -2977,27 +2985,18 @@
               </w:rPr>
               <w:t>dwh</w:t>
             </w:r>
-            <w:r>
-              <w:rPr>
-                <w:rFonts w:eastAsia="Times New Roman" w:cs="Calibri" w:cstheme="minorHAnsi"/>
-                <w:kern w:val="0"/>
-                <w:sz w:val="22"/>
-                <w:szCs w:val="22"/>
-                <w:lang w:val="lv-LV" w:eastAsia="lv-LV" w:bidi="ar-SA"/>
-              </w:rPr>
-              <w:t> </w:t>
-            </w:r>
-          </w:p>
-        </w:tc>
-        <w:tc>
-          <w:tcPr>
-            <w:tcW w:w="2223" w:type="dxa"/>
-            <w:tcBorders/>
-          </w:tcPr>
-          <w:p>
-            <w:pPr>
-              <w:pStyle w:val="Normal"/>
-              <w:widowControl/>
+          </w:p>
+        </w:tc>
+        <w:tc>
+          <w:tcPr>
+            <w:tcW w:w="2224" w:type="dxa"/>
+            <w:tcBorders/>
+          </w:tcPr>
+          <w:p>
+            <w:pPr>
+              <w:pStyle w:val="Normal"/>
+              <w:widowControl/>
+              <w:suppressAutoHyphens w:val="true"/>
               <w:spacing w:lineRule="auto" w:line="240" w:beforeAutospacing="1" w:after="0"/>
               <w:jc w:val="left"/>
               <w:rPr>
@@ -3015,16 +3014,6 @@
               </w:rPr>
               <w:t> </w:t>
             </w:r>
-            <w:r>
-              <w:rPr>
-                <w:rFonts w:eastAsia="Times New Roman" w:cs="Calibri" w:cstheme="minorHAnsi"/>
-                <w:kern w:val="0"/>
-                <w:sz w:val="22"/>
-                <w:szCs w:val="22"/>
-                <w:lang w:val="lv-LV" w:eastAsia="lv-LV" w:bidi="ar-SA"/>
-              </w:rPr>
-              <w:t> </w:t>
-            </w:r>
           </w:p>
         </w:tc>
         <w:tc>
@@ -3036,6 +3025,7 @@
             <w:pPr>
               <w:pStyle w:val="Normal"/>
               <w:widowControl/>
+              <w:suppressAutoHyphens w:val="true"/>
               <w:spacing w:lineRule="auto" w:line="240" w:beforeAutospacing="1" w:after="0"/>
               <w:jc w:val="left"/>
               <w:rPr>
@@ -3052,16 +3042,6 @@
                 <w:lang w:val="en-US" w:eastAsia="lv-LV" w:bidi="ar-SA"/>
               </w:rPr>
               <w:t>main BI database schema. Holds all dimensions and facts used for analysis</w:t>
-            </w:r>
-            <w:r>
-              <w:rPr>
-                <w:rFonts w:eastAsia="Times New Roman" w:cs="Calibri" w:cstheme="minorHAnsi"/>
-                <w:kern w:val="0"/>
-                <w:sz w:val="22"/>
-                <w:szCs w:val="22"/>
-                <w:lang w:val="lv-LV" w:eastAsia="lv-LV" w:bidi="ar-SA"/>
-              </w:rPr>
-              <w:t> </w:t>
             </w:r>
           </w:p>
         </w:tc>
@@ -3070,13 +3050,14 @@
         <w:trPr/>
         <w:tc>
           <w:tcPr>
-            <w:tcW w:w="1715" w:type="dxa"/>
-            <w:tcBorders/>
-          </w:tcPr>
-          <w:p>
-            <w:pPr>
-              <w:pStyle w:val="Normal"/>
-              <w:widowControl/>
+            <w:tcW w:w="1714" w:type="dxa"/>
+            <w:tcBorders/>
+          </w:tcPr>
+          <w:p>
+            <w:pPr>
+              <w:pStyle w:val="Normal"/>
+              <w:widowControl/>
+              <w:suppressAutoHyphens w:val="true"/>
               <w:spacing w:lineRule="auto" w:line="240" w:beforeAutospacing="1" w:after="0"/>
               <w:jc w:val="left"/>
               <w:rPr>
@@ -3094,27 +3075,18 @@
               </w:rPr>
               <w:t>dwh_conf</w:t>
             </w:r>
-            <w:r>
-              <w:rPr>
-                <w:rFonts w:eastAsia="Times New Roman" w:cs="Calibri" w:cstheme="minorHAnsi"/>
-                <w:kern w:val="0"/>
-                <w:sz w:val="22"/>
-                <w:szCs w:val="22"/>
-                <w:lang w:val="lv-LV" w:eastAsia="lv-LV" w:bidi="ar-SA"/>
-              </w:rPr>
-              <w:t> </w:t>
-            </w:r>
-          </w:p>
-        </w:tc>
-        <w:tc>
-          <w:tcPr>
-            <w:tcW w:w="2223" w:type="dxa"/>
-            <w:tcBorders/>
-          </w:tcPr>
-          <w:p>
-            <w:pPr>
-              <w:pStyle w:val="Normal"/>
-              <w:widowControl/>
+          </w:p>
+        </w:tc>
+        <w:tc>
+          <w:tcPr>
+            <w:tcW w:w="2224" w:type="dxa"/>
+            <w:tcBorders/>
+          </w:tcPr>
+          <w:p>
+            <w:pPr>
+              <w:pStyle w:val="Normal"/>
+              <w:widowControl/>
+              <w:suppressAutoHyphens w:val="true"/>
               <w:spacing w:lineRule="auto" w:line="240" w:beforeAutospacing="1" w:after="0"/>
               <w:jc w:val="left"/>
               <w:rPr>
@@ -3132,16 +3104,6 @@
               </w:rPr>
               <w:t> </w:t>
             </w:r>
-            <w:r>
-              <w:rPr>
-                <w:rFonts w:eastAsia="Times New Roman" w:cs="Calibri" w:cstheme="minorHAnsi"/>
-                <w:kern w:val="0"/>
-                <w:sz w:val="22"/>
-                <w:szCs w:val="22"/>
-                <w:lang w:val="lv-LV" w:eastAsia="lv-LV" w:bidi="ar-SA"/>
-              </w:rPr>
-              <w:t> </w:t>
-            </w:r>
           </w:p>
         </w:tc>
         <w:tc>
@@ -3153,6 +3115,7 @@
             <w:pPr>
               <w:pStyle w:val="Normal"/>
               <w:widowControl/>
+              <w:suppressAutoHyphens w:val="true"/>
               <w:spacing w:lineRule="auto" w:line="240" w:beforeAutospacing="1" w:after="0"/>
               <w:jc w:val="left"/>
               <w:rPr>
@@ -3169,16 +3132,6 @@
                 <w:lang w:val="en-US" w:eastAsia="lv-LV" w:bidi="ar-SA"/>
               </w:rPr>
               <w:t>schema that holds configuration (K) tables (parameters, mappings, etc.) and manually entered info that is not otherwise recoverable</w:t>
-            </w:r>
-            <w:r>
-              <w:rPr>
-                <w:rFonts w:eastAsia="Times New Roman" w:cs="Calibri" w:cstheme="minorHAnsi"/>
-                <w:kern w:val="0"/>
-                <w:sz w:val="22"/>
-                <w:szCs w:val="22"/>
-                <w:lang w:val="lv-LV" w:eastAsia="lv-LV" w:bidi="ar-SA"/>
-              </w:rPr>
-              <w:t> </w:t>
             </w:r>
           </w:p>
         </w:tc>
@@ -3187,13 +3140,14 @@
         <w:trPr/>
         <w:tc>
           <w:tcPr>
-            <w:tcW w:w="1715" w:type="dxa"/>
-            <w:tcBorders/>
-          </w:tcPr>
-          <w:p>
-            <w:pPr>
-              <w:pStyle w:val="Normal"/>
-              <w:widowControl/>
+            <w:tcW w:w="1714" w:type="dxa"/>
+            <w:tcBorders/>
+          </w:tcPr>
+          <w:p>
+            <w:pPr>
+              <w:pStyle w:val="Normal"/>
+              <w:widowControl/>
+              <w:suppressAutoHyphens w:val="true"/>
               <w:spacing w:lineRule="auto" w:line="240" w:beforeAutospacing="1" w:after="0"/>
               <w:jc w:val="left"/>
               <w:rPr>
@@ -3211,27 +3165,18 @@
               </w:rPr>
               <w:t>dwh_hist</w:t>
             </w:r>
-            <w:r>
-              <w:rPr>
-                <w:rFonts w:eastAsia="Times New Roman" w:cs="Calibri" w:cstheme="minorHAnsi"/>
-                <w:kern w:val="0"/>
-                <w:sz w:val="22"/>
-                <w:szCs w:val="22"/>
-                <w:lang w:val="lv-LV" w:eastAsia="lv-LV" w:bidi="ar-SA"/>
-              </w:rPr>
-              <w:t> </w:t>
-            </w:r>
-          </w:p>
-        </w:tc>
-        <w:tc>
-          <w:tcPr>
-            <w:tcW w:w="2223" w:type="dxa"/>
-            <w:tcBorders/>
-          </w:tcPr>
-          <w:p>
-            <w:pPr>
-              <w:pStyle w:val="Normal"/>
-              <w:widowControl/>
+          </w:p>
+        </w:tc>
+        <w:tc>
+          <w:tcPr>
+            <w:tcW w:w="2224" w:type="dxa"/>
+            <w:tcBorders/>
+          </w:tcPr>
+          <w:p>
+            <w:pPr>
+              <w:pStyle w:val="Normal"/>
+              <w:widowControl/>
+              <w:suppressAutoHyphens w:val="true"/>
               <w:spacing w:lineRule="auto" w:line="240" w:beforeAutospacing="1" w:after="0"/>
               <w:jc w:val="left"/>
               <w:rPr>
@@ -3249,16 +3194,6 @@
               </w:rPr>
               <w:t> </w:t>
             </w:r>
-            <w:r>
-              <w:rPr>
-                <w:rFonts w:eastAsia="Times New Roman" w:cs="Calibri" w:cstheme="minorHAnsi"/>
-                <w:kern w:val="0"/>
-                <w:sz w:val="22"/>
-                <w:szCs w:val="22"/>
-                <w:lang w:val="lv-LV" w:eastAsia="lv-LV" w:bidi="ar-SA"/>
-              </w:rPr>
-              <w:t> </w:t>
-            </w:r>
           </w:p>
         </w:tc>
         <w:tc>
@@ -3270,6 +3205,7 @@
             <w:pPr>
               <w:pStyle w:val="Normal"/>
               <w:widowControl/>
+              <w:suppressAutoHyphens w:val="true"/>
               <w:spacing w:lineRule="auto" w:line="240" w:beforeAutospacing="1" w:after="0"/>
               <w:jc w:val="left"/>
               <w:rPr>
@@ -3285,17 +3221,7 @@
                 <w:szCs w:val="22"/>
                 <w:lang w:val="en-US" w:eastAsia="lv-LV" w:bidi="ar-SA"/>
               </w:rPr>
-              <w:t>observed to store historic ids from source system to ids generated in DWH, $H table name? </w:t>
-            </w:r>
-            <w:r>
-              <w:rPr>
-                <w:rFonts w:eastAsia="Times New Roman" w:cs="Calibri" w:cstheme="minorHAnsi"/>
-                <w:kern w:val="0"/>
-                <w:sz w:val="22"/>
-                <w:szCs w:val="22"/>
-                <w:lang w:val="lv-LV" w:eastAsia="lv-LV" w:bidi="ar-SA"/>
-              </w:rPr>
-              <w:t> </w:t>
+              <w:t>observed to store historic ids from source system to ids generated in DWH, $H table name?</w:t>
             </w:r>
           </w:p>
         </w:tc>
@@ -3304,13 +3230,14 @@
         <w:trPr/>
         <w:tc>
           <w:tcPr>
-            <w:tcW w:w="1715" w:type="dxa"/>
-            <w:tcBorders/>
-          </w:tcPr>
-          <w:p>
-            <w:pPr>
-              <w:pStyle w:val="Normal"/>
-              <w:widowControl/>
+            <w:tcW w:w="1714" w:type="dxa"/>
+            <w:tcBorders/>
+          </w:tcPr>
+          <w:p>
+            <w:pPr>
+              <w:pStyle w:val="Normal"/>
+              <w:widowControl/>
+              <w:suppressAutoHyphens w:val="true"/>
               <w:spacing w:lineRule="auto" w:line="240" w:beforeAutospacing="1" w:after="0"/>
               <w:jc w:val="left"/>
               <w:rPr>
@@ -3328,27 +3255,18 @@
               </w:rPr>
               <w:t>staging_%</w:t>
             </w:r>
-            <w:r>
-              <w:rPr>
-                <w:rFonts w:eastAsia="Times New Roman" w:cs="Calibri" w:cstheme="minorHAnsi"/>
-                <w:kern w:val="0"/>
-                <w:sz w:val="22"/>
-                <w:szCs w:val="22"/>
-                <w:lang w:val="lv-LV" w:eastAsia="lv-LV" w:bidi="ar-SA"/>
-              </w:rPr>
-              <w:t> </w:t>
-            </w:r>
-          </w:p>
-        </w:tc>
-        <w:tc>
-          <w:tcPr>
-            <w:tcW w:w="2223" w:type="dxa"/>
-            <w:tcBorders/>
-          </w:tcPr>
-          <w:p>
-            <w:pPr>
-              <w:pStyle w:val="Normal"/>
-              <w:widowControl/>
+          </w:p>
+        </w:tc>
+        <w:tc>
+          <w:tcPr>
+            <w:tcW w:w="2224" w:type="dxa"/>
+            <w:tcBorders/>
+          </w:tcPr>
+          <w:p>
+            <w:pPr>
+              <w:pStyle w:val="Normal"/>
+              <w:widowControl/>
+              <w:suppressAutoHyphens w:val="true"/>
               <w:spacing w:lineRule="auto" w:line="240" w:beforeAutospacing="1" w:after="0"/>
               <w:jc w:val="left"/>
               <w:rPr>
@@ -3366,16 +3284,6 @@
               </w:rPr>
               <w:t>staging_system</w:t>
             </w:r>
-            <w:r>
-              <w:rPr>
-                <w:rFonts w:eastAsia="Times New Roman" w:cs="Calibri" w:cstheme="minorHAnsi"/>
-                <w:kern w:val="0"/>
-                <w:sz w:val="22"/>
-                <w:szCs w:val="22"/>
-                <w:lang w:val="lv-LV" w:eastAsia="lv-LV" w:bidi="ar-SA"/>
-              </w:rPr>
-              <w:t> </w:t>
-            </w:r>
           </w:p>
         </w:tc>
         <w:tc>
@@ -3387,6 +3295,7 @@
             <w:pPr>
               <w:pStyle w:val="Normal"/>
               <w:widowControl/>
+              <w:suppressAutoHyphens w:val="true"/>
               <w:spacing w:lineRule="auto" w:line="240" w:beforeAutospacing="1" w:after="0"/>
               <w:jc w:val="left"/>
               <w:rPr>
@@ -3403,16 +3312,6 @@
                 <w:lang w:val="en-US" w:eastAsia="lv-LV" w:bidi="ar-SA"/>
               </w:rPr>
               <w:t>schema that holds stage data from % system</w:t>
-            </w:r>
-            <w:r>
-              <w:rPr>
-                <w:rFonts w:eastAsia="Times New Roman" w:cs="Calibri" w:cstheme="minorHAnsi"/>
-                <w:kern w:val="0"/>
-                <w:sz w:val="22"/>
-                <w:szCs w:val="22"/>
-                <w:lang w:val="lv-LV" w:eastAsia="lv-LV" w:bidi="ar-SA"/>
-              </w:rPr>
-              <w:t> </w:t>
             </w:r>
           </w:p>
         </w:tc>
@@ -3421,13 +3320,14 @@
         <w:trPr/>
         <w:tc>
           <w:tcPr>
-            <w:tcW w:w="1715" w:type="dxa"/>
-            <w:tcBorders/>
-          </w:tcPr>
-          <w:p>
-            <w:pPr>
-              <w:pStyle w:val="Normal"/>
-              <w:widowControl/>
+            <w:tcW w:w="1714" w:type="dxa"/>
+            <w:tcBorders/>
+          </w:tcPr>
+          <w:p>
+            <w:pPr>
+              <w:pStyle w:val="Normal"/>
+              <w:widowControl/>
+              <w:suppressAutoHyphens w:val="true"/>
               <w:spacing w:lineRule="auto" w:line="240" w:beforeAutospacing="1" w:after="0"/>
               <w:jc w:val="left"/>
               <w:rPr>
@@ -3445,27 +3345,18 @@
               </w:rPr>
               <w:t>staging_%__hist</w:t>
             </w:r>
-            <w:r>
-              <w:rPr>
-                <w:rFonts w:eastAsia="Times New Roman" w:cs="Calibri" w:cstheme="minorHAnsi"/>
-                <w:kern w:val="0"/>
-                <w:sz w:val="22"/>
-                <w:szCs w:val="22"/>
-                <w:lang w:val="lv-LV" w:eastAsia="lv-LV" w:bidi="ar-SA"/>
-              </w:rPr>
-              <w:t> </w:t>
-            </w:r>
-          </w:p>
-        </w:tc>
-        <w:tc>
-          <w:tcPr>
-            <w:tcW w:w="2223" w:type="dxa"/>
-            <w:tcBorders/>
-          </w:tcPr>
-          <w:p>
-            <w:pPr>
-              <w:pStyle w:val="Normal"/>
-              <w:widowControl/>
+          </w:p>
+        </w:tc>
+        <w:tc>
+          <w:tcPr>
+            <w:tcW w:w="2224" w:type="dxa"/>
+            <w:tcBorders/>
+          </w:tcPr>
+          <w:p>
+            <w:pPr>
+              <w:pStyle w:val="Normal"/>
+              <w:widowControl/>
+              <w:suppressAutoHyphens w:val="true"/>
               <w:spacing w:lineRule="auto" w:line="240" w:beforeAutospacing="1" w:after="0"/>
               <w:jc w:val="left"/>
               <w:rPr>
@@ -3483,16 +3374,6 @@
               </w:rPr>
               <w:t>staging_system__hist</w:t>
             </w:r>
-            <w:r>
-              <w:rPr>
-                <w:rFonts w:eastAsia="Times New Roman" w:cs="Calibri" w:cstheme="minorHAnsi"/>
-                <w:kern w:val="0"/>
-                <w:sz w:val="22"/>
-                <w:szCs w:val="22"/>
-                <w:lang w:val="lv-LV" w:eastAsia="lv-LV" w:bidi="ar-SA"/>
-              </w:rPr>
-              <w:t> </w:t>
-            </w:r>
           </w:p>
         </w:tc>
         <w:tc>
@@ -3504,6 +3385,7 @@
             <w:pPr>
               <w:pStyle w:val="Normal"/>
               <w:widowControl/>
+              <w:suppressAutoHyphens w:val="true"/>
               <w:spacing w:lineRule="auto" w:line="240" w:beforeAutospacing="1" w:after="0"/>
               <w:jc w:val="left"/>
               <w:rPr>
@@ -3520,16 +3402,6 @@
                 <w:lang w:val="en-US" w:eastAsia="lv-LV" w:bidi="ar-SA"/>
               </w:rPr>
               <w:t>schema that holds historic stage data from % system. Table names J$?</w:t>
-            </w:r>
-            <w:r>
-              <w:rPr>
-                <w:rFonts w:eastAsia="Times New Roman" w:cs="Calibri" w:cstheme="minorHAnsi"/>
-                <w:kern w:val="0"/>
-                <w:sz w:val="22"/>
-                <w:szCs w:val="22"/>
-                <w:lang w:val="lv-LV" w:eastAsia="lv-LV" w:bidi="ar-SA"/>
-              </w:rPr>
-              <w:t> </w:t>
             </w:r>
           </w:p>
         </w:tc>
@@ -3538,13 +3410,14 @@
         <w:trPr/>
         <w:tc>
           <w:tcPr>
-            <w:tcW w:w="1715" w:type="dxa"/>
-            <w:tcBorders/>
-          </w:tcPr>
-          <w:p>
-            <w:pPr>
-              <w:pStyle w:val="Normal"/>
-              <w:widowControl/>
+            <w:tcW w:w="1714" w:type="dxa"/>
+            <w:tcBorders/>
+          </w:tcPr>
+          <w:p>
+            <w:pPr>
+              <w:pStyle w:val="Normal"/>
+              <w:widowControl/>
+              <w:suppressAutoHyphens w:val="true"/>
               <w:spacing w:lineRule="auto" w:line="240" w:beforeAutospacing="1" w:after="0"/>
               <w:jc w:val="left"/>
               <w:rPr>
@@ -3562,27 +3435,18 @@
               </w:rPr>
               <w:t>key_%</w:t>
             </w:r>
-            <w:r>
-              <w:rPr>
-                <w:rFonts w:eastAsia="Times New Roman" w:cs="Calibri" w:cstheme="minorHAnsi"/>
-                <w:kern w:val="0"/>
-                <w:sz w:val="22"/>
-                <w:szCs w:val="22"/>
-                <w:lang w:val="lv-LV" w:eastAsia="lv-LV" w:bidi="ar-SA"/>
-              </w:rPr>
-              <w:t> </w:t>
-            </w:r>
-          </w:p>
-        </w:tc>
-        <w:tc>
-          <w:tcPr>
-            <w:tcW w:w="2223" w:type="dxa"/>
-            <w:tcBorders/>
-          </w:tcPr>
-          <w:p>
-            <w:pPr>
-              <w:pStyle w:val="Normal"/>
-              <w:widowControl/>
+          </w:p>
+        </w:tc>
+        <w:tc>
+          <w:tcPr>
+            <w:tcW w:w="2224" w:type="dxa"/>
+            <w:tcBorders/>
+          </w:tcPr>
+          <w:p>
+            <w:pPr>
+              <w:pStyle w:val="Normal"/>
+              <w:widowControl/>
+              <w:suppressAutoHyphens w:val="true"/>
               <w:spacing w:lineRule="auto" w:line="240" w:beforeAutospacing="1" w:after="0"/>
               <w:jc w:val="left"/>
               <w:rPr>
@@ -3600,16 +3464,6 @@
               </w:rPr>
               <w:t> </w:t>
             </w:r>
-            <w:r>
-              <w:rPr>
-                <w:rFonts w:eastAsia="Times New Roman" w:cs="Calibri" w:cstheme="minorHAnsi"/>
-                <w:kern w:val="0"/>
-                <w:sz w:val="22"/>
-                <w:szCs w:val="22"/>
-                <w:lang w:val="lv-LV" w:eastAsia="lv-LV" w:bidi="ar-SA"/>
-              </w:rPr>
-              <w:t> </w:t>
-            </w:r>
           </w:p>
         </w:tc>
         <w:tc>
@@ -3621,6 +3475,7 @@
             <w:pPr>
               <w:pStyle w:val="Normal"/>
               <w:widowControl/>
+              <w:suppressAutoHyphens w:val="true"/>
               <w:spacing w:lineRule="auto" w:line="240" w:beforeAutospacing="1" w:after="0"/>
               <w:jc w:val="left"/>
               <w:rPr>
@@ -3637,16 +3492,6 @@
                 <w:lang w:val="en-US" w:eastAsia="lv-LV" w:bidi="ar-SA"/>
               </w:rPr>
               <w:t>KEY tables that store key mapping for table IDD mapping</w:t>
-            </w:r>
-            <w:r>
-              <w:rPr>
-                <w:rFonts w:eastAsia="Times New Roman" w:cs="Calibri" w:cstheme="minorHAnsi"/>
-                <w:kern w:val="0"/>
-                <w:sz w:val="22"/>
-                <w:szCs w:val="22"/>
-                <w:lang w:val="lv-LV" w:eastAsia="lv-LV" w:bidi="ar-SA"/>
-              </w:rPr>
-              <w:t> </w:t>
             </w:r>
           </w:p>
         </w:tc>
@@ -4725,6 +4570,7 @@
     <w:qFormat/>
     <w:pPr>
       <w:widowControl/>
+      <w:suppressAutoHyphens w:val="true"/>
       <w:bidi w:val="0"/>
       <w:spacing w:lineRule="auto" w:line="259" w:before="0" w:after="160"/>
       <w:jc w:val="left"/>

</xml_diff>